<commit_message>
Template compliance: number References heading (7), add List of Figures/Tables
- References heading now '7 References' per the University of Vienna template ToC
- List of Figures and List of Tables added after the ToC (template requires them
  'if any' - the thesis now contains Figure 1 and Tables 1-2); implemented as
  Word TOC fields over new FigureCaption/TableCaption paragraph styles so
  'Update Field' populates them with page numbers

Co-Authored-By: Claude Fable 5 <noreply@anthropic.com>
Claude-Session: https://claude.ai/code/session_01HJq9GBe6o3FZumGTYdfLDW
</commit_message>
<xml_diff>
--- a/thesis/COMPILED_DRAFT_FULL.docx
+++ b/thesis/COMPILED_DRAFT_FULL.docx
@@ -376,6 +376,9 @@
       </w:r>
     </w:p>
     <w:p>
+      <w:pPr>
+        <w:pStyle w:val="FigureCaption"/>
+      </w:pPr>
       <w:r>
         <w:rPr>
           <w:b/>
@@ -431,6 +434,9 @@
       </w:r>
     </w:p>
     <w:p>
+      <w:pPr>
+        <w:pStyle w:val="TableCaption"/>
+      </w:pPr>
       <w:r>
         <w:rPr>
           <w:b/>
@@ -2086,6 +2092,9 @@
       </w:r>
     </w:p>
     <w:p>
+      <w:pPr>
+        <w:pStyle w:val="TableCaption"/>
+      </w:pPr>
       <w:r>
         <w:rPr>
           <w:b/>
@@ -4330,7 +4339,7 @@
         <w:pStyle w:val="Heading1"/>
       </w:pPr>
       <w:r>
-        <w:t>References</w:t>
+        <w:t>7 References</w:t>
       </w:r>
     </w:p>
     <w:p>
@@ -20499,6 +20508,22 @@
       </w:tcPr>
     </w:tblStylePr>
   </w:style>
+  <w:style w:type="paragraph" w:customStyle="1" w:styleId="FigureCaption">
+    <w:name w:val="FigureCaption"/>
+    <w:basedOn w:val="Normal"/>
+    <w:rPr>
+      <w:rFonts w:ascii="Times New Roman" w:hAnsi="Times New Roman"/>
+      <w:sz w:val="24"/>
+    </w:rPr>
+  </w:style>
+  <w:style w:type="paragraph" w:customStyle="1" w:styleId="TableCaption">
+    <w:name w:val="TableCaption"/>
+    <w:basedOn w:val="Normal"/>
+    <w:rPr>
+      <w:rFonts w:ascii="Times New Roman" w:hAnsi="Times New Roman"/>
+      <w:sz w:val="24"/>
+    </w:rPr>
+  </w:style>
 </w:styles>
 </file>
 

</xml_diff>

<commit_message>
Unify citation style: end-of-sentence parenthetical throughout, matching benchmark thesis
Converted every narrative/embedded citation ("Author (Year) argues/shows/finds...",
"as noted by X", "the study by X (Year)", "reported by X (Year)") into the
end-of-sentence parenthetical form (Author, Year), consistent across all six
chapters and the methodology chapter. No claim, evidence-type attribution, or
hedging language was changed - only citation placement. Content, source
attributions, and citation-reference consistency (35 references, all cited,
no orphans) verified unchanged after the rewrite.

Co-Authored-By: Claude Fable 5 <noreply@anthropic.com>
Claude-Session: https://claude.ai/code/session_01HJq9GBe6o3FZumGTYdfLDW
</commit_message>
<xml_diff>
--- a/thesis/COMPILED_DRAFT_FULL.docx
+++ b/thesis/COMPILED_DRAFT_FULL.docx
@@ -184,17 +184,17 @@
     </w:p>
     <w:p>
       <w:r>
-        <w:t>The study of manufacturing relocation has always been plagued by a lack of uniformity in terminology. Tsai and Urmetzer (2024) review 158 studies on manufacturing relocation and conclude that the concepts of offshoring, reshoring, backshoring, and nearshoring have been used inconsistently in both industrial and regional contexts, and that reshoring can be viewed as an umbrella term for relocation to the home country and relocation to a proximate country. This thesis uses a more narrow definition: Reshoring is defined as the relocation of previously offshored manufacturing activities from an Asian host country to the firm's home country.</w:t>
+        <w:t>The study of manufacturing relocation has always been plagued by a lack of uniformity in terminology. A review of 158 studies on manufacturing relocation concludes that the concepts of offshoring, reshoring, backshoring, and nearshoring have been used inconsistently in both industrial and regional contexts, and that reshoring can be viewed as an umbrella term for relocation to the home country and relocation to a proximate country (Tsai &amp; Urmetzer, 2024). This thesis uses a more narrow definition: Reshoring is defined as the relocation of previously offshored manufacturing activities from an Asian host country to the firm's home country.</w:t>
       </w:r>
     </w:p>
     <w:p>
       <w:r>
-        <w:t>Ocicka (2016) also defines reshoring as the reversal of a previous offshoring decision, which is useful in highlighting two key elements: first, there must have been an offshoring decision in the past, and second, the activity must be brought back home and not simply moved elsewhere.</w:t>
+        <w:t>Reshoring has also been defined as the reversal of a previous offshoring decision, which is useful in highlighting two key elements: first, there must have been an offshoring decision in the past, and second, the activity must be brought back home and not simply moved elsewhere (Ocicka, 2016).</w:t>
       </w:r>
     </w:p>
     <w:p>
       <w:r>
-        <w:t>The narrower definition is important because there are some relocation patterns that superficially look like reshoring that are not included. Production that is moved from one foreign host to another (e.g. from China to a lower-cost Asian country) is not considered reshoring, but rather re-offshoring or diversification; nearshoring, which moves production to a country closer to home but not back home, is also not included. These differences follow the terminology consolidated by Tsai and Urmetzer (2024) in their review of the relocation literature.</w:t>
+        <w:t>The narrower definition is important because there are some relocation patterns that superficially look like reshoring that are not included. Production that is moved from one foreign host to another (e.g. from China to a lower-cost Asian country) is not considered reshoring, but rather re-offshoring or diversification; nearshoring, which moves production to a country closer to home but not back home, is also not included. These differences follow the terminology consolidated in the review of the relocation literature (Tsai &amp; Urmetzer, 2024).</w:t>
       </w:r>
     </w:p>
     <w:p>
@@ -204,7 +204,7 @@
     </w:p>
     <w:p>
       <w:r>
-        <w:t>In addition to definition, recent research has begun to think of reshoring as a process rather than a decision. Pedroletti and Ciabuschi (2023) categorise the literature into five sequential themes: antecedents, contingencies, decision, implementation, and outcome, and suggest a research agenda for each. This process view is fundamental for the current research, as it renders the implementation as a separate phase, which starts once the decision to reshore has been made and which has its own challenges.</w:t>
+        <w:t>In addition to definition, recent research has begun to think of reshoring as a process rather than a decision. The literature has been categorised into five sequential themes — antecedents, contingencies, decision, implementation, and outcome — with a research agenda suggested for each (Pedroletti &amp; Ciabuschi, 2023). This process view is fundamental for the current research, as it renders the implementation as a separate phase, which starts once the decision to reshore has been made and which has its own challenges.</w:t>
       </w:r>
     </w:p>
     <w:p>
@@ -217,17 +217,17 @@
     </w:p>
     <w:p>
       <w:r>
-        <w:t>The reshoring literature is based on a variety of theoretical approaches, and there is no single unified theory; Wiesmann et al. (2017) note that there is currently no consensus on a "theory of reshoring" and review the theories employed in previous studies. The lenses of individual studies vary: Li et al. (2025) draw on Dunning's eclectic paradigm for their empirical analysis, Pedroletti (2025) uses a business-network perspective from internationalisation-process theory, and D'Ambrosio and Lavoratori (2025) build on trade-theoretic work on de-globalisation and global value chains.</w:t>
+        <w:t>The reshoring literature is based on a variety of theoretical approaches, and there is no single unified theory; there is currently no consensus on a "theory of reshoring", and previous studies have employed a range of different theoretical lenses (Wiesmann et al., 2017). The lenses of individual studies vary: one empirical analysis draws on Dunning's eclectic paradigm (Li et al., 2025), another applies a business-network perspective from internationalisation-process theory (Pedroletti, 2025), and a third builds on trade-theoretic work on de-globalisation and global value chains (D'Ambrosio &amp; Lavoratori, 2025).</w:t>
       </w:r>
     </w:p>
     <w:p>
       <w:r>
-        <w:t>In this plural background, the two theories used in this thesis are Transaction Cost Economics (TCE) and the Resource-Based View (RBV), as originally formulated (Williamson, 1985; Barney, 1991); if a reviewed study uses a different theory, this is indicated. Transaction Cost Economics, as developed by Williamson (1985), directs attention to the costs of organising economic activity across firm and country boundaries, emphasising asset specificity, contractual safeguards, and the governance of exchange relationships. Williamson did not study reshoring; applying these concepts to the return of production is this thesis's own interpretation. From a TCE perspective, the exit side of implementation becomes visible: offshore arrangements embody committed investments and contractual obligations, and unwinding them carries real costs. Empirical evidence that is consistent with this logic includes the existence of strict layoff regulations in the host country, and locked investments that make it difficult to exit the host country quickly (Li et al., 2025), plant-closure fees and fiscal obligations reported in the review literature (Di Stefano &amp; Fratocchi, 2019), and the coordination burden that arises when production is split between home and host locations during a partial return (Pedroletti, 2025). Transaction-cost reasoning also suggests that there are hidden costs: Ocicka (2016) argues that unit price-based sourcing decisions systematically underestimate the total cost of offshore acquisition, and Boffelli et al. (2021) report on the operational adjustments that relocation requires, which firms underestimate.</w:t>
+        <w:t>In this plural background, the two theories used in this thesis are Transaction Cost Economics (TCE) and the Resource-Based View (RBV), as originally formulated (Williamson, 1985; Barney, 1991); if a reviewed study uses a different theory, this is indicated. Transaction Cost Economics directs attention to the costs of organising economic activity across firm and country boundaries, emphasising asset specificity, contractual safeguards, and the governance of exchange relationships (Williamson, 1985). This theory was not developed with reshoring in mind, and applying its concepts to the return of production is this thesis's own interpretation. From a TCE perspective, the exit side of implementation becomes visible: offshore arrangements embody committed investments and contractual obligations, and unwinding them carries real costs. Empirical evidence that is consistent with this logic includes the existence of strict layoff regulations in the host country, and locked investments that make it difficult to exit the host country quickly (Li et al., 2025), plant-closure fees and fiscal obligations reported in the review literature (Di Stefano &amp; Fratocchi, 2019), and the coordination burden that arises when production is split between home and host locations during a partial return (Pedroletti, 2025). Transaction-cost reasoning also points to hidden costs: sourcing decisions based on unit price are argued to systematically underestimate the total cost of offshore acquisition (Ocicka, 2016), and firms are reported to underestimate the operational adjustments that relocation requires (Boffelli et al., 2021).</w:t>
       </w:r>
     </w:p>
     <w:p>
       <w:r>
-        <w:t>The Resource-Based View, which is based on Barney's (1991) theory that competitive advantage is based on resources that are valuable, rare, imperfectly imitable and non-substitutable, provides insights on the arrival side of implementation; this is the author's interpretation of how the RBV applies to reshoring, as with TCE. The RBV perspective suggests that the firm is a bundle of resources and capabilities, and reshoring will only be successful if the firm can rebuild or reacquire the productive resources (skills, machinery, routines, supplier relationships) needed by the home operation. The reshoring literature repeatedly mentions exactly such capability constraints: the loss of domestic manufacturing competences and capacity after long periods of offshoring (Wiesmann et al., 2017), the lack of specialized manpower faced by reshoring firms (Di Mauro et al., 2018), and the need to rebuild machinery, tooling, and workforce skills documented in case evidence (Pegoraro et al., 2022). Conceptual work complements this reading: D'Ambrosio and Lavoratori (2025) argue that reshoring presents new fixed costs and capability requirements for firms, and existing value chains are "sticky" due to investments in them. Combined, the two lenses are complementary: TCE helps to understand why it is expensive to leave the host country and the RBV helps to understand why it is difficult to re-establish production at home.</w:t>
+        <w:t>The Resource-Based View — the theory that competitive advantage rests on resources that are valuable, rare, imperfectly imitable and non-substitutable (Barney, 1991) — provides insights on the arrival side of implementation; as with TCE, this application to reshoring is the author's own interpretation. The RBV perspective suggests that the firm is a bundle of resources and capabilities, and reshoring will only be successful if the firm can rebuild or reacquire the productive resources (skills, machinery, routines, supplier relationships) needed by the home operation. The reshoring literature repeatedly mentions exactly such capability constraints: the loss of domestic manufacturing competences and capacity after long periods of offshoring (Wiesmann et al., 2017), the lack of specialized manpower faced by reshoring firms (Di Mauro et al., 2018), and the need to rebuild machinery, tooling, and workforce skills documented in case evidence (Pegoraro et al., 2022). Conceptual work complements this reading: reshoring is argued to present new fixed costs and capability requirements for firms, with existing value chains remaining "sticky" due to prior investment (D'Ambrosio &amp; Lavoratori, 2025). Combined, the two lenses are complementary: TCE helps to understand why it is expensive to leave the host country and the RBV helps to understand why it is difficult to re-establish production at home.</w:t>
       </w:r>
     </w:p>
     <w:p>
@@ -245,7 +245,7 @@
     </w:p>
     <w:p>
       <w:r>
-        <w:t>Case studies introduce brand-related motives: Robinson and Hsieh (2016) show how a luxury clothing firm's re-positioning on provenance and quality resulted in the concentration of production in the home country. Quality, coordination and flexibility issues at offshore locations also emerge as reasons for return (Di Mauro et al., 2018).</w:t>
+        <w:t>Case studies introduce brand-related motives: a luxury clothing firm's re-positioning on provenance and quality is shown to have resulted in the concentration of production in the home country (Robinson &amp; Hsieh, 2016). Quality, coordination and flexibility issues at offshore locations also emerge as reasons for return (Di Mauro et al., 2018).</w:t>
       </w:r>
     </w:p>
     <w:p>
@@ -268,7 +268,7 @@
     </w:p>
     <w:p>
       <w:r>
-        <w:t>Subsequent review studies have taken the barrier debate in certain directions. Di Stefano and Fratocchi (2019) discuss the link between backshoring and sustainability and demonstrate that environmental and social considerations can be drivers, outcomes, or barriers, such as regulatory and social barriers to exit the host country. Technology-readiness themes are derived from reviews that highlight how technology can make reshoring more attractive by decreasing the relevance of labour costs and increasing the relevance of proximity, but also that new technical skills, organisational adaptation and investment are required for its deployment (Espíndola et al., 2023; Bilbao-Ubillos et al., 2024). Similarly, Gupta et al. (2023) state that Industry 4.0 has a dual effect, enabling reshoring and creating new capability requirements. Conceptually, D'Ambrosio and Lavoratori (2025) combine some of these strands, arguing that the stickiness of existing value chains, the new fixed costs of domestic production, and firm-size differences (larger firms may prefer nearshoring or friendshoring, smaller, constrained firms may reshore defensively "to survive") explain the rarity of reshoring. Empirical studies on high-cost home environments reveal that firms producing in their home countries are under labour-cost pressure, suffer from a shortage of skills, and experience gaps in their supplier networks and internal organisational friction (Mirzaei et al., 2021), which any repatriating firm will inherit.</w:t>
+        <w:t>Subsequent review studies have taken the barrier debate in certain directions. The link between backshoring and sustainability has been discussed, showing that environmental and social considerations can be drivers, outcomes, or barriers, such as regulatory and social barriers to exit the host country (Di Stefano &amp; Fratocchi, 2019). Technology-readiness themes are derived from reviews that highlight how technology can make reshoring more attractive by decreasing the relevance of labour costs and increasing the relevance of proximity, but also that new technical skills, organisational adaptation and investment are required for its deployment (Espíndola et al., 2023; Bilbao-Ubillos et al., 2024). Similarly, Industry 4.0 is said to have a dual effect, enabling reshoring while creating new capability requirements (Gupta et al., 2023). Conceptually, some of these strands are combined in an argument that the stickiness of existing value chains, the new fixed costs of domestic production, and firm-size differences — larger firms may prefer nearshoring or friendshoring, while smaller, constrained firms may reshore defensively "to survive" — explain the rarity of reshoring (D'Ambrosio &amp; Lavoratori, 2025). Empirical studies on high-cost home environments reveal that firms producing in their home countries are under labour-cost pressure, suffer from a shortage of skills, and experience gaps in their supplier networks and internal organisational friction (Mirzaei et al., 2021), which any repatriating firm will inherit.</w:t>
       </w:r>
     </w:p>
     <w:p>
@@ -309,7 +309,7 @@
     </w:p>
     <w:p>
       <w:r>
-        <w:t>Snyder (2019) indicates that a literature review itself can be used as a research method and there are three types of literature review: systematic, semi-systematic, and integrative, which can be used for a variety of purposes. If a question is specific enough to be answered by locating and assessing a set of relevant studies using a set of criteria, then a systematic review is appropriate. The research question in the present research is specific and set at the firm level, which makes a systematic design the most suitable of the three, despite the methodological diversity of the evidence. The rest of the chapter is organized in four phases of the review process outlined by Snyder (2019): designing the review, conducting the review, analyzing the review and writing the review. The framework is used here in its general form as a methodological reason, and reporting and synthesis guidance is provided in the following sections.</w:t>
+        <w:t>A literature review itself can be used as a research method, and there are three types of literature review — systematic, semi-systematic, and integrative — that can be used for a variety of purposes (Snyder, 2019). If a question is specific enough to be answered by locating and assessing a set of relevant studies using a set of criteria, then a systematic review is appropriate. The research question in the present research is specific and set at the firm level, which makes a systematic design the most suitable of the three, despite the methodological diversity of the evidence. The rest of the chapter is organised in four phases of the review process: designing the review, conducting the review, analysing the review, and writing the review (Snyder, 2019). The framework is used here in its general form as a methodological reason, and reporting and synthesis guidance is provided in the following sections.</w:t>
       </w:r>
     </w:p>
     <w:p>
@@ -425,12 +425,12 @@
     </w:p>
     <w:p>
       <w:r>
-        <w:t>The evidence that was included was analysed in an adapted way using a three-stage process of synthesising findings across studies developed by Thomas and Harden (2008). In the first phase, the findings of relevant studies in the included studies were coded on the level of meaningful evidence segments. The second stage involved grouping codes into descriptive categories, which remained close to the content of the main studies, when they were conceptually similar. In the third stage, descriptive themes were interpreted to generate higher-order analytical themes to answer the research questions and exceed those identified by any single study individually. One of the strengths of this procedure is that it allows for an audit trail to be kept from the conclusions made in the review to the original text of the primary studies, enabling each analytical theme to be followed through the descriptive themes to the coded evidence.</w:t>
+        <w:t>The evidence that was included was analysed using an adapted three-stage process for synthesising findings across studies (Thomas &amp; Harden, 2008). In the first phase, the findings of relevant studies in the included studies were coded on the level of meaningful evidence segments. The second stage involved grouping codes into descriptive categories, which remained close to the content of the main studies, when they were conceptually similar. In the third stage, descriptive themes were interpreted to generate higher-order analytical themes to answer the research questions and exceed those identified by any single study individually. One of the strengths of this procedure is that it allows for an audit trail to be kept from the conclusions made in the review to the original text of the primary studies, enabling each analytical theme to be followed through the descriptive themes to the coded evidence.</w:t>
       </w:r>
     </w:p>
     <w:p>
       <w:r>
-        <w:t>The coding itself was based on a deductive-inductive logic for which Mayring (2014) provides the methodological basis. Mayring (2014) considers qualitative content analysis as a systematic, rule-governed method in which the application of deductive categories and the development of inductive categories are not mutually exclusive. Based on this, the four categories of the thesis framework — regulatory/institutional, cultural/organisational, cost/operational and asset/capability — were deductively derived from the theoretical framework and the research questions and were used as an a priori coding frame. The included studies were then inductively clustered into more specific category themes within each of these general categories, and the boundaries of the categories were refined when the a priori frame did not adequately cover the coded material. The outcome was a set of barrier themes that were embedded in the four deductive categories. Table 1 documents this coding: each barrier theme, the category it belongs to, and the studies whose evidence was coded to it, separated by evidence type.</w:t>
+        <w:t>The coding itself was based on a deductive-inductive logic (Mayring, 2014). Qualitative content analysis is considered a systematic, rule-governed method in which the application of deductive categories and the development of inductive categories are not mutually exclusive (Mayring, 2014). Based on this, the four categories of the thesis framework — regulatory/institutional, cultural/organisational, cost/operational and asset/capability — were deductively derived from the theoretical framework and the research questions and were used as an a priori coding frame. The included studies were then inductively clustered into more specific category themes within each of these general categories, and the boundaries of the categories were refined when the a priori frame did not adequately cover the coded material. The outcome was a set of barrier themes that were embedded in the four deductive categories. Table 1 documents this coding: each barrier theme, the category it belongs to, and the studies whose evidence was coded to it, separated by evidence type.</w:t>
       </w:r>
     </w:p>
     <w:p>
@@ -4009,7 +4009,7 @@
     </w:p>
     <w:p>
       <w:r>
-        <w:t>The first theme relates to constraints that the host country imposes on exiting the offshore operation. The study by Li et al. (2025) explicitly mentions Poland and China as countries of offshoring that had strict rules regarding layoffs, but the results are presented for the sample and not broken down by individual host country; nevertheless, strict host-country layoff regulations, the difficulty of closing or quickly reducing offshore operations, locked investments, and high exit costs were cited as barriers among the Swedish manufacturing companies examined in their study. Convergent constraints are discussed in the back-shoring literature, including national closure regulations, foreign-plant exit costs in the form of closure-fees and fiscal obligations, and host-country layoff constraints (Di Stefano &amp; Fratocchi, 2019). The findings and the review evidence together suggest that the exit side of reshoring can also be regulated in a way which can delay or burden the reshoring implementation.</w:t>
+        <w:t>The first theme relates to constraints that the host country imposes on exiting the offshore operation. Strict host-country layoff regulations, the difficulty of closing or quickly reducing offshore operations, locked investments, and high exit costs were cited as barriers among the Swedish manufacturing companies studied, with Poland and China explicitly named among the host countries with strict layoff rules, although the results are reported for the sample as a whole rather than broken down by individual host country (Li et al., 2025). Convergent constraints are discussed in the back-shoring literature, including national closure regulations, foreign-plant exit costs in the form of closure fees and fiscal obligations, and host-country layoff constraints (Di Stefano &amp; Fratocchi, 2019). The findings and the review evidence together suggest that the exit side of reshoring can also be regulated in a way which can delay or burden the reshoring implementation.</w:t>
       </w:r>
     </w:p>
     <w:p>
@@ -4019,7 +4019,7 @@
     </w:p>
     <w:p>
       <w:r>
-        <w:t>Institutional tensions have a different look on the home side. A problem for the competitive domestic manufacturing is the lack of match between the national education system and manufacturing skill needs, as noted by Mirzaei et al. (2021). Gupta et al. (2023) theoretically define home-country regulatory compliance as a constraint, and when it imposes high costs, delays, or requirements for capabilities, it is a barrier.</w:t>
+        <w:t>Institutional tensions have a different look on the home side. A problem for competitive domestic manufacturing is the lack of match between the national education system and manufacturing skill needs (Mirzaei et al., 2021). Home-country regulatory compliance is theoretically defined as a constraint, and when it imposes high costs, delays, or requirements for capabilities, it is a barrier (Gupta et al., 2023).</w:t>
       </w:r>
     </w:p>
     <w:p>
@@ -4032,12 +4032,12 @@
     </w:p>
     <w:p>
       <w:r>
-        <w:t>The most direct evidence in this category relates to the implementation stage itself. In the four fashion-industry relocation cases examined by Boffelli et al. (2021), the failure of relocation initiatives was directly linked to errors in the implementation phase, and the authors identify insufficient internal organisational readiness, managerial behavioural biases, and learning through trial-and-error during implementation as implementation-stage problems; the central conclusion of the study is that reshoring succeeds only if firms manage implementation correctly. These findings are general implementation evidence for the cases of Romanian, Moroccan, Croatian and Hungarian host locations. The literature reviewed reveals related organisational weaknesses: the immaturity of firms' reshoring processes and internal communication gaps (Wiesmann et al., 2017), and, conceptually, a managerial-capability gap has been argued to limit reshoring, especially for smaller firms (D'Ambrosio &amp; Lavoratori, 2025).</w:t>
+        <w:t>The most direct evidence in this category relates to the implementation stage itself. In four fashion-industry relocation cases, the failure of relocation initiatives was directly linked to errors in the implementation phase, with insufficient internal organisational readiness, managerial behavioural biases, and learning through trial-and-error during implementation identified as implementation-stage problems; the central conclusion is that reshoring succeeds only if firms manage implementation correctly (Boffelli et al., 2021). These findings are general implementation evidence for the cases of Romanian, Moroccan, Croatian and Hungarian host locations. The literature reviewed reveals related organisational weaknesses: the immaturity of firms' reshoring processes and internal communication gaps (Wiesmann et al., 2017), and, conceptually, a managerial-capability gap has been argued to limit reshoring, especially for smaller firms (D'Ambrosio &amp; Lavoratori, 2025).</w:t>
       </w:r>
     </w:p>
     <w:p>
       <w:r>
-        <w:t>The second, less common discovery relates to the internal structure of the firm. According to Mirzaei et al. (2021), the challenges to competitive domestic manufacturing include silos between product development, production, sourcing, sales, and finance, and lack of employee involvement. This is evidence from one study in the general context of the home-country in Sweden and not a pattern across the corpus.</w:t>
+        <w:t>The second, less common discovery relates to the internal structure of the firm: challenges to competitive domestic manufacturing include silos between product development, production, sourcing, sales, and finance, and a lack of employee involvement (Mirzaei et al., 2021). This is evidence from one study in the general context of the home country in Sweden and not a pattern across the corpus.</w:t>
       </w:r>
     </w:p>
     <w:p>
@@ -4065,17 +4065,17 @@
     </w:p>
     <w:p>
       <w:r>
-        <w:t>The first cost/operational theme is the lack of domestic supply base. Mirzaei et al. (2021) conclude that even after production is resumed, companies can continue to rely on foreign suppliers due to the absence of domestic materials, specialised components, supplier know-how, or adequate scale. Di Mauro et al. (2018) also identify a shortage of suppliers in high-cost home countries and the need to rebuild suppliers as challenges associated with backshoring, though the specific cases are not identified in the four cases in that study, two of which were backshored from China. The theme is echoed in the review literature: weak home-country supplier capacity, local networks, and supply-chain integration are reported as barriers (Wiesmann et al., 2017), and the erosion of domestic supplier networks is identified as an implementation concern discussed in the reshoring literature (Ocicka, 2016). A domestic quality-supplier gap is also conceptually noted (Gupta et al., 2023).</w:t>
+        <w:t>The first cost/operational theme is the lack of domestic supply base: even after production is resumed, companies can continue to rely on foreign suppliers due to the absence of domestic materials, specialised components, supplier know-how, or adequate scale (Mirzaei et al., 2021). A shortage of suppliers in high-cost home countries and the need to rebuild suppliers are also identified as challenges associated with backshoring, although the specific cases are not attributed individually among the four cases in that study, two of which were backshored from China (Di Mauro et al., 2018). The theme is echoed in the review literature: weak home-country supplier capacity, local networks, and supply-chain integration are reported as barriers (Wiesmann et al., 2017), and the erosion of domestic supplier networks is identified as an implementation concern discussed in the reshoring literature (Ocicka, 2016). A domestic quality-supplier gap is also conceptually noted (Gupta et al., 2023).</w:t>
       </w:r>
     </w:p>
     <w:p>
       <w:r>
-        <w:t>The return creates new costs. In the Swedish companies examined by Li et al. (2025), cost miscalculation was found when the cost problems occurred during or after relocation. Implementation-cost escalation and cost-coordination complexity are among the barriers at the reshoring-Industry 4.0 intersection at the review level (Espíndola et al., 2023). The new fixed costs of reshoring (building or rebuilding a plant, buying or rebuilding equipment and automation, hiring and training workers, and rebuilding a domestic supplier network) are conceptually described as among the most direct implementation barriers by D'Ambrosio and Lavoratori (2025), while switching and reconfiguration costs (including duplicate operations during the transition) are conceptually identified by Gupta et al. (2023). These new costs of the return are in addition to the sunk costs of the offshore operation, which are reported separately in Section 4.5.</w:t>
+        <w:t>The return creates new costs: cost miscalculation occurred during or after relocation among the Swedish companies studied (Li et al., 2025). Implementation-cost escalation and cost-coordination complexity are among the barriers at the reshoring-Industry 4.0 intersection at the review level (Espíndola et al., 2023). The new fixed costs of reshoring — building or rebuilding a plant, buying or rebuilding equipment and automation, hiring and training workers, and rebuilding a domestic supplier network — are conceptually described as among the most direct implementation barriers (D'Ambrosio &amp; Lavoratori, 2025), while switching and reconfiguration costs, including duplicate operations during the transition, are identified as a further cost barrier at the conceptual level (Gupta et al., 2023). These new costs of the return are in addition to the sunk costs of the offshore operation, which are reported separately in Section 4.5.</w:t>
       </w:r>
     </w:p>
     <w:p>
       <w:r>
-        <w:t>A high cost home environment, in turn, does not preclude physical relocation, but rather limits the viability and extent of reshoring. Labour cost was identified as a challenge by all five case companies investigated by Mirzaei et al. (2021), as well as high energy and overhead costs; labour, overhead, and total costs were also among the most common barriers mentioned by the Swedish companies in the study by Li et al. (2025). The economic viability and extent of the return is conceptually said to be influenced by a home-country factor-cost disadvantage (D'Ambrosio &amp; Lavoratori, 2025). This theme is mentioned here only as a limitation on re-established domestic production, but not as a reason for the original offshoring decision.</w:t>
+        <w:t>A high cost home environment, in turn, does not preclude physical relocation, but rather limits the viability and extent of reshoring. Labour cost, along with high energy and overhead costs, was identified as a challenge by all five case companies studied (Mirzaei et al., 2021); labour, overhead, and total costs were also among the most common barriers mentioned by the Swedish companies studied (Li et al., 2025). The economic viability and extent of the return is conceptually said to be influenced by a home-country factor-cost disadvantage (D'Ambrosio &amp; Lavoratori, 2025). This theme is mentioned here only as a limitation on re-established domestic production, but not as a reason for the original offshoring decision.</w:t>
       </w:r>
     </w:p>
     <w:p>
@@ -4085,7 +4085,7 @@
     </w:p>
     <w:p>
       <w:r>
-        <w:t>Lastly, the multi-case fashion study by Boffelli et al. (2021) identified the underestimation of operational adjustments during the transfer as the most significant barrier to implementation, which is related to the reconfiguration of the manufacturing process and the adaptation of the internal production. The finding is the study's own and is not extrapolated beyond the four cases.</w:t>
+        <w:t>Lastly, the underestimation of operational adjustments during the transfer — related to the reconfiguration of the manufacturing process and the adaptation of internal production — was identified as the most significant implementation barrier in the multi-case fashion study (Boffelli et al., 2021). The finding is the study's own and is not extrapolated beyond the four cases.</w:t>
       </w:r>
     </w:p>
     <w:p>
@@ -4098,12 +4098,12 @@
     </w:p>
     <w:p>
       <w:r>
-        <w:t>The most widely cited barrier in the corpus is the loss of domestic skilled labour and manufacturing competence, which is found in direct case evidence, throughout the review literature and in conceptual argument. In the China-to-UK case reported by Pegoraro et al. (2022), the company did not have the knowledge to make the part on its own; in this case, the learning curve (getting the equipment to work, training employees, gaining experience, and achieving acceptable quality) took about a year. Li et al. (2025) found an internal competence gap (competencies lost over years of offshoring) and Mirzaei et al. (2021) found a domestic skilled-labour shortage (loss of tacit knowledge, lack of core manufacturing competencies, and high training time and cost) among Swedish firms. Di Mauro et al. (2018) state that lack of specialised manpower and loss of domestic competences are constraints in implementing the return. A shortage of skilled labour (Wiesmann et al., 2017), a technical-skills shortage and a generational manufacturing-skills gap (Ocicka, 2016), and a digital technical-skills shortage (Bilbao-Ubillos et al., 2024) are reported at the review level, while a domestic skilled-workforce shortage (D'Ambrosio &amp; Lavoratori, 2025) and a domestic labour-availability gap (Gupta et al., 2023) are argued conceptually.</w:t>
+        <w:t>The most widely cited barrier in the corpus is the loss of domestic skilled labour and manufacturing competence, which is found in direct case evidence, throughout the review literature and in conceptual argument. In the China-to-UK case, the company did not have the knowledge to make the part on its own, and the learning curve — getting the equipment to work, training employees, gaining experience, and achieving acceptable quality — took about a year (Pegoraro et al., 2022). An internal competence gap, described as competencies lost over years of offshoring, was found among Swedish firms (Li et al., 2025), and a domestic skilled-labour shortage — loss of tacit knowledge, lack of core manufacturing competencies, and high training time and cost — was found among Swedish firms in a related study (Mirzaei et al., 2021). A lack of specialised manpower and loss of domestic competences are also identified as constraints in implementing the return (Di Mauro et al., 2018). A shortage of skilled labour (Wiesmann et al., 2017), a technical-skills shortage and a generational manufacturing-skills gap (Ocicka, 2016), and a digital technical-skills shortage (Bilbao-Ubillos et al., 2024) are reported at the review level, while a domestic skilled-workforce shortage (D'Ambrosio &amp; Lavoratori, 2025) and a domestic labour-availability gap (Gupta et al., 2023) are argued conceptually.</w:t>
       </w:r>
     </w:p>
     <w:p>
       <w:r>
-        <w:t>The physical aspect of capability rebuilding is closely related. As in the case of China to UK, the re-establishment of production is not just about purchasing a machine, but also about identifying the required technology, finding and integrating the appropriate equipment, and acquiring tooling, tooling suppliers, software, technical support, and specialised services, that is, rebuilding an interconnected production system (Pegoraro et al., 2022). Even after the decision to reshore, Swedish companies reported a domestic capacity shortage (Li et al., 2025), and Mirzaei et al. (2021) reported a domestic production-capacity gap (insufficient facilities, equipment limits, and investment resources). The review literature documents a domestic capacity shortage and an infrastructure lock-out after a long period of offshoring (Wiesmann et al., 2017), and the theme is conceptually mentioned in the new-fixed-costs argument (D'Ambrosio &amp; Lavoratori, 2025) and in a conceptually noted domestic infrastructure gap (Gupta et al., 2023).</w:t>
+        <w:t>The physical aspect of capability rebuilding is closely related. As in the case of China to UK, the re-establishment of production is not just about purchasing a machine, but also about identifying the required technology, finding and integrating the appropriate equipment, and acquiring tooling, tooling suppliers, software, technical support, and specialised services, that is, rebuilding an interconnected production system (Pegoraro et al., 2022). Even after the decision to reshore, Swedish companies reported a domestic capacity shortage (Li et al., 2025), and a domestic production-capacity gap — insufficient facilities, equipment limits, and investment resources — was reported in a related study of Swedish firms (Mirzaei et al., 2021). The review literature documents a domestic capacity shortage and an infrastructure lock-out after a long period of offshoring (Wiesmann et al., 2017), and the theme is conceptually mentioned in the new-fixed-costs argument (D'Ambrosio &amp; Lavoratori, 2025) and in a conceptually noted domestic infrastructure gap (Gupta et al., 2023).</w:t>
       </w:r>
     </w:p>
     <w:p>
@@ -4113,7 +4113,7 @@
     </w:p>
     <w:p>
       <w:r>
-        <w:t>Established value chains also exhibit inertia. Offshore sunk-cost inertia is reported at review level (Bilbao-Ubillos et al., 2024), and D'Ambrosio and Lavoratori (2025) argue conceptually that value chains are "sticky", especially for large firms, due to sunk investment, established supplier relationships, specialised infrastructure, and location-specific knowledge. This theme is based on review and conceptual evidence, and the sunk costs offshore described in this theme are different from the new fixed costs of the return described in Section 4.4.</w:t>
+        <w:t>Established value chains also exhibit inertia. Offshore sunk-cost inertia is reported at review level (Bilbao-Ubillos et al., 2024), and value chains are conceptually argued to be "sticky", especially for large firms, due to sunk investment, established supplier relationships, specialised infrastructure, and location-specific knowledge (D'Ambrosio &amp; Lavoratori, 2025). This theme is based on review and conceptual evidence, and the sunk costs offshore described in this theme are different from the new fixed costs of the return described in Section 4.4.</w:t>
       </w:r>
     </w:p>
     <w:p>
@@ -4149,7 +4149,7 @@
     </w:p>
     <w:p>
       <w:r>
-        <w:t>The most striking pattern in the results is the predominance of the asset/capability category. The only barrier theme that is supported by direct case evidence, review syntheses and conceptual argument is the domestic skills and competence gap, and the physical counterpart — missing capacity, machinery and complementary tooling — is almost as broadly supported. The evidence thus suggests that the main challenge of reshoring is not so much about making the right decision, or even about paying for the reshoring, but about rebuilding productive capacity that has been lost over the years of offshoring. The most compelling evidence for this interpretation is the China-to-UK case reported by Pegoraro et al. (2022), where the acquisition of the machinery was only the first step: the company had to acquire tooling, software, technical services, and train its workforce for about a year before production quality was acceptable. In this case (Pegoraro et al., 2022), a single acquisition decision was followed by a twelve-month capability-building process, providing a more tangible example than any overall finding of the need for a separate analysis of the implementation stage. The general empirical evidence is in the same direction. Even after the reshoring decision, Swedish companies faced challenges related to lack of skills, equipment, and capacity (Li et al., 2025; Mirzaei et al., 2021), while reshoring companies in labour-intensive sectors experienced a shortage of skilled workforce (Di Mauro et al., 2018). The same cluster is found in review-level syntheses in the broader literature (Wiesmann et al., 2017; Ocicka, 2016). The results of Li et al. (2025), however, are presented at the level of their Swedish sample and not disaggregated by host country; they support the general pattern, not a China-specific claim.</w:t>
+        <w:t>The most striking pattern in the results is the predominance of the asset/capability category. The only barrier theme that is supported by direct case evidence, review syntheses and conceptual argument is the domestic skills and competence gap, and the physical counterpart — missing capacity, machinery and complementary tooling — is almost as broadly supported. The evidence thus suggests that the main challenge of reshoring is not so much about making the right decision, or even about paying for the reshoring, but about rebuilding productive capacity that has been lost over the years of offshoring. The most compelling evidence for this interpretation is the China-to-UK case, where the acquisition of the machinery was only the first step: the company had to acquire tooling, software, technical services, and train its workforce for about a year before production quality was acceptable (Pegoraro et al., 2022). In this case (Pegoraro et al., 2022), a single acquisition decision was followed by a twelve-month capability-building process, providing a more tangible example than any overall finding of the need for a separate analysis of the implementation stage. The general empirical evidence is in the same direction. Even after the reshoring decision, Swedish companies faced challenges related to lack of skills, equipment, and capacity (Li et al., 2025; Mirzaei et al., 2021), while reshoring companies in labour-intensive sectors experienced a shortage of skilled workforce (Di Mauro et al., 2018). The same cluster is found in review-level syntheses in the broader literature (Wiesmann et al., 2017; Ocicka, 2016). The results of Li et al. (2025), however, are presented at the level of their Swedish sample and not disaggregated by host country; they support the general pattern, not a China-specific claim.</w:t>
       </w:r>
     </w:p>
     <w:p>
@@ -4159,12 +4159,12 @@
     </w:p>
     <w:p>
       <w:r>
-        <w:t>The results also indicate that barrier categories are not independent, but interact. The most obvious example is the China-to-Italy case reported by Pedroletti (2025). There, the firm's inability to fully reshore due to dependence on specialised supplier capabilities (asset/capability barrier) led to a partial return, which in turn created new coordination costs and reduced the firm's bargaining power towards the remaining suppliers (cost/operational barrier), while the reduced order volumes strained the supplier relationship itself (organisational and relational barrier) (Pedroletti, 2025). One capability gap thus led to operational and relational challenges. The same relationship seems to hold between organisational readiness and all other categories: Boffelli et al. (2021) discovered that relocation failures were directly linked to implementation-stage errors, meaning that if a firm is not ready, any other obstacle it faces becomes a failure, as what a ready firm can overcome becomes a failure for an unprepared firm. Organisational readiness should thus not be interpreted as one of eighteen barriers, but rather as a condition that influences the impact of the other barriers. The cases of Boffelli et al. (2021) were not Asian, but European and North African host countries, so this is not an Asia-specific finding, but rather a description of a general implementation mechanism.</w:t>
+        <w:t>The results also indicate that barrier categories are not independent, but interact. The most obvious example is the China-to-Italy case (Pedroletti, 2025). There, the firm's inability to fully reshore due to dependence on specialised supplier capabilities (asset/capability barrier) led to a partial return, which in turn created new coordination costs and reduced the firm's bargaining power towards the remaining suppliers (cost/operational barrier), while the reduced order volumes strained the supplier relationship itself (organisational and relational barrier) (Pedroletti, 2025). One capability gap thus led to operational and relational challenges. The same relationship seems to hold between organisational readiness and all other categories: relocation failures were found to be directly linked to implementation-stage errors, meaning that if a firm is not ready, any other obstacle it faces becomes a failure — what a ready firm can overcome becomes a failure for an unprepared firm (Boffelli et al., 2021). Organisational readiness should thus not be interpreted as one of eighteen barriers, but rather as a condition that influences the impact of the other barriers. The host countries in this study were not Asian, but European and North African, so this is not an Asia-specific finding, but rather a description of a general implementation mechanism (Boffelli et al., 2021).</w:t>
       </w:r>
     </w:p>
     <w:p>
       <w:r>
-        <w:t>It is important to highlight the difference between full and partial reshoring, as this alters the meaning of "barrier". In the traditional interpretation, a barrier is an element that increases the difficulty or failure of reshoring. The evidence from Pedroletti (2025) suggests a second possibility: barriers can limit the extent of reshoring, resulting in a hybrid scenario where some production is brought back and some stays offshore. If so, the barrier wasn't an obstacle to the project, it was a redefinition of the project. This is relevant for interpretation because studies that capture reshoring as a binary event may not capture such partial outcomes at all, and because a partial return is not a one-off transition cost, but rather an ongoing operational burden, as reported in the case (Pedroletti, 2025). The evidence indicates, tentatively, that partial reshoring is not just a strategic decision, but sometimes the visible sign of implementation obstacles that prevented full reshoring.</w:t>
+        <w:t>It is important to highlight the difference between full and partial reshoring, as this alters the meaning of "barrier". In the traditional interpretation, a barrier is an element that increases the difficulty or failure of reshoring. A second possibility emerges from the case evidence: barriers can limit the extent of reshoring, resulting in a hybrid scenario where some production is brought back and some stays offshore (Pedroletti, 2025). If so, the barrier wasn't an obstacle to the project, it was a redefinition of the project. This is relevant for interpretation because studies that capture reshoring as a binary event may not capture such partial outcomes at all, and because a partial return is not a one-off transition cost, but rather an ongoing operational burden, as reported in the case (Pedroletti, 2025). The evidence indicates, tentatively, that partial reshoring is not just a strategic decision, but sometimes the visible sign of implementation obstacles that prevented full reshoring.</w:t>
       </w:r>
     </w:p>
     <w:p>
@@ -4202,7 +4202,7 @@
     </w:p>
     <w:p>
       <w:r>
-        <w:t>It should be recognized that this theoretical apparatus is limited. Two findings are somewhat out of place in it: the negative relational response of the Chinese supplier in Pedroletti's (2025) study is more of a network and embeddedness phenomenon, as trust and mutual orientation are not firm-level costs or resources, but rather a relationship-level phenomenon; and the education-system mismatch reported by Mirzaei et al. (2021) is an institutional condition, which neither TCE nor RBV directly addresses, as no individual firm can transact or resource its way out of a national skills shortage. The application of TCE and RBV as the organising lenses thus provides analytical clarity at the cost of neglecting the relational and institutional aspects, which could be a focus for future theoretical research on reshoring implementation.</w:t>
+        <w:t>It should be recognized that this theoretical apparatus is limited. Two findings are somewhat out of place in it: the negative relational response of the Chinese supplier is more of a network and embeddedness phenomenon, as trust and mutual orientation are not firm-level costs or resources, but rather a relationship-level phenomenon (Pedroletti, 2025); and the education-system mismatch is an institutional condition, which neither TCE nor RBV directly addresses, as no individual firm can transact or resource its way out of a national skills shortage (Mirzaei et al., 2021). The application of TCE and RBV as the organising lenses thus provides analytical clarity at the cost of neglecting the relational and institutional aspects, which could be a focus for future theoretical research on reshoring implementation.</w:t>
       </w:r>
     </w:p>
     <w:p>
@@ -4225,7 +4225,7 @@
     </w:p>
     <w:p>
       <w:r>
-        <w:t>The results at the exit stage show the importance of legal and regulatory due diligence in the host country long before the decision is announced. The rate and the cost of exit in the firms examined by Li et al. (2025) were influenced by layoff policies, closure policies, and contractual requirements, and the literature review includes closure fees, fiscal requirements, and the social aspect of plant closure (Di Stefano &amp; Fratocchi, 2019). The exit costs and timelines should be considered as a separate budget line by a firm that is considering reshoring, and, where the evidence on employee and stakeholder reactions is taken seriously (Di Stefano &amp; Fratocchi, 2019), the communication and treatment of the offshore workforce should be planned as a part of the implementation, not as an afterthought.</w:t>
+        <w:t>The results at the exit stage show the importance of legal and regulatory due diligence in the host country long before the decision is announced. The rate and cost of exit among the firms studied were influenced by layoff policies, closure policies, and contractual requirements (Li et al., 2025), and the literature review includes closure fees, fiscal requirements, and the social aspect of plant closure (Di Stefano &amp; Fratocchi, 2019). The exit costs and timelines should be considered as a separate budget line by a firm that is considering reshoring, and, where the evidence on employee and stakeholder reactions is taken seriously (Di Stefano &amp; Fratocchi, 2019), the communication and treatment of the offshore workforce should be planned as a part of the implementation, not as an afterthought.</w:t>
       </w:r>
     </w:p>
     <w:p>

</xml_diff>

<commit_message>
Add methodological grounding sentence to Ch. 1 Objectives (Snyder, 2019)
The Objectives section otherwise describes only the thesis's own research
plan and has no literature claim to cite. Added one closing sentence
noting that structuring the four objectives this way follows established
SLR guidance on formulating clear review aims (Snyder, 2019) - a genuine,
already-verified methodology source, not a new addition to the corpus.

Co-Authored-By: Claude Fable 5 <noreply@anthropic.com>
Claude-Session: https://claude.ai/code/session_01HJq9GBe6o3FZumGTYdfLDW
</commit_message>
<xml_diff>
--- a/thesis/COMPILED_DRAFT_FULL.docx
+++ b/thesis/COMPILED_DRAFT_FULL.docx
@@ -159,6 +159,11 @@
     <w:p>
       <w:r>
         <w:t>Lastly, managerial implications are drawn for international businesses that are considering or are in the process of reshoring from Asian markets. The implications are designed to help companies to foresee, evaluate and address implementation challenges prior to and during the move.</w:t>
+      </w:r>
+    </w:p>
+    <w:p>
+      <w:r>
+        <w:t>Structuring the objectives in this way, tied directly to identification, categorisation, theoretical interpretation and managerial translation, follows established guidance on formulating clear aims for a systematic literature review (Snyder, 2019).</w:t>
       </w:r>
     </w:p>
     <w:p>

</xml_diff>

<commit_message>
Fix remaining embedded citations found via a more reliable per-citation scan
The grep-based checks used earlier had blind spots (e.g. failed silently on
"et al." followed directly by a year with no trailing name-word). Replaced
with a Python scan that inspects every citation's surrounding context
directly. Found and fixed 6 further embedded citations across Ch. 2, 4, and
5 ("the literature review by X (Year), who...", "is given by X (Year)
who...", "in the multi-case study, X (Year), although...", "The four fashion
cases of X (Year) are...", "The results of X (Year) are/however..." x2),
converting each to the standard trailing (Author, Year) form without
changing any claim or attribution. Citation-reference consistency (35
entries, all cited) reconfirmed after the rewrite.

Co-Authored-By: Claude Fable 5 <noreply@anthropic.com>
Claude-Session: https://claude.ai/code/session_01HJq9GBe6o3FZumGTYdfLDW
</commit_message>
<xml_diff>
--- a/thesis/COMPILED_DRAFT_FULL.docx
+++ b/thesis/COMPILED_DRAFT_FULL.docx
@@ -245,7 +245,7 @@
     </w:p>
     <w:p>
       <w:r>
-        <w:t>This thesis makes a distinction between the motivations for reshoring and the challenges of reshoring. The literature on drivers is relatively well developed (Wiesmann et al., 2017). Di Mauro et al. (2018) conclude that offshoring is primarily motivated by cost reduction, while backshoring typically occurs as a result of a strategic reorientation towards customer perceived value and that the return is not necessarily a managerial error, but rather a strategic evolution. Quantitative firm-level evidence links reshoring decisions to home-country conditions (Wan et al., 2019) and to Industry 4.0 adoption, pandemic experience, and made-in effects (Stentoft et al., 2025), while survey and case research has explored the link between digital-technology adoption and backshoring decisions (Kamp &amp; Gibaja, 2021).</w:t>
+        <w:t>This thesis makes a distinction between the motivations for reshoring and the challenges of reshoring. The literature on drivers is relatively well developed (Wiesmann et al., 2017). Offshoring is concluded to be primarily motivated by cost reduction, while backshoring typically occurs as a result of a strategic reorientation towards customer perceived value, and the return is not necessarily a managerial error, but rather a strategic evolution (Di Mauro et al., 2018). Quantitative firm-level evidence links reshoring decisions to home-country conditions (Wan et al., 2019) and to Industry 4.0 adoption, pandemic experience, and made-in effects (Stentoft et al., 2025), while survey and case research has explored the link between digital-technology adoption and backshoring decisions (Kamp &amp; Gibaja, 2021).</w:t>
       </w:r>
     </w:p>
     <w:p>
@@ -255,7 +255,7 @@
     </w:p>
     <w:p>
       <w:r>
-        <w:t>But drivers tell only why companies want to return — not whether they do. Implementation barriers as defined in this thesis are the challenges that arise when a firm prepares, transfers, rebuilds, integrates and stabilises production at home after the reshoring decision has been made. The difference is analytically significant because factors that are important in the driver literature, such as increases in foreign wages or supply-chain disruptions, are not implementation barriers unless evidence suggests that they hindered the implementation process itself. The most evident empirical evidence that the two stages are different is given by Boffelli et al. (2021) who analyze four relocation cases in the fashion sector and differentiate between decision-making mistakes and implementation mistakes. Their major conclusion is that the failures of relocation initiatives were directly related to the failures in the implementation phase, and that "doing things right" in the implementation phase is more important than "doing the right thing" at the decision phase. This separation is supported at a conceptual level by a process framework that considers implementation as a stage with its own contingencies and outcomes (Pedroletti &amp; Ciabuschi, 2023).</w:t>
+        <w:t>But drivers tell only why companies want to return — not whether they do. Implementation barriers as defined in this thesis are the challenges that arise when a firm prepares, transfers, rebuilds, integrates and stabilises production at home after the reshoring decision has been made. The difference is analytically significant because factors that are important in the driver literature, such as increases in foreign wages or supply-chain disruptions, are not implementation barriers unless evidence suggests that they hindered the implementation process itself. The most evident empirical evidence that the two stages are different comes from four relocation cases in the fashion sector, analysed to differentiate between decision-making mistakes and implementation mistakes (Boffelli et al., 2021). Their major conclusion is that the failures of relocation initiatives were directly related to the failures in the implementation phase, and that "doing things right" in the implementation phase is more important than "doing the right thing" at the decision phase. This separation is supported at a conceptual level by a process framework that considers implementation as a stage with its own contingencies and outcomes (Pedroletti &amp; Ciabuschi, 2023).</w:t>
       </w:r>
     </w:p>
     <w:p>
@@ -268,7 +268,7 @@
     </w:p>
     <w:p>
       <w:r>
-        <w:t>The most systematic early treatment of reshoring barriers is the literature review by Wiesmann et al. (2017), who classify both drivers and barriers into five sets of dynamics: global competitive dynamics, home-country, host-country, supply-chain and firm-specific factors. On the barrier side, the review points to the absence of offshore production resources at home, a lack of skilled people in both the host and home countries, and a lack of supplier capacity and networks at home. However, as a review, it combines the results of very different primary studies and its five-dynamics structure is different from the firm-level framework developed in this thesis.</w:t>
+        <w:t>The most systematic early treatment of reshoring barriers is a literature review that classifies both drivers and barriers into five sets of dynamics: global competitive dynamics, home-country, host-country, supply-chain and firm-specific factors (Wiesmann et al., 2017). On the barrier side, the review points to the absence of offshore production resources at home, a lack of skilled people in both the host and home countries, and a lack of supplier capacity and networks at home. However, as a review, it combines the results of very different primary studies and its five-dynamics structure is different from the firm-level framework developed in this thesis.</w:t>
       </w:r>
     </w:p>
     <w:p>
@@ -2088,7 +2088,7 @@
     </w:p>
     <w:p>
       <w:r>
-        <w:t>There are few examples of direct implementation evidence specific to Asia. It is based on two single-cases; the first concerns a case from China to UK (Pegoraro et al., 2022), and the second concerns a partial reshoring from China to Italy (Pedroletti, 2025). Two of the four case firms moved production out of China in the multi-case study, Di Mauro et al. (2018), although the findings are not always attributed to the individual cases. The four fashion cases of Boffelli et al. (2021) are by contrast Romanian, Moroccan, Croatian and Hungarian host-areas and thus the results of this implementation enter the synthesis as general, rather than Asia-specific evidence. The results of Li et al. (2025) are also presented as general Nordic/Swedish evidence, except that it specifically mentions China among the host locations that are impacted by strict layoff regulations (see Section 4.2).</w:t>
+        <w:t>There are few examples of direct implementation evidence specific to Asia. It is based on two single-cases; the first concerns a case from China to UK (Pegoraro et al., 2022), and the second concerns a partial reshoring from China to Italy (Pedroletti, 2025). Two of the four case firms moved production out of China in the multi-case study, although the findings are not always attributed to the individual cases (Di Mauro et al., 2018). The four fashion cases are, by contrast, Romanian, Moroccan, Croatian and Hungarian host-areas, so the results of this implementation enter the synthesis as general, rather than Asia-specific, evidence (Boffelli et al., 2021). The Nordic/Swedish evidence is likewise presented as general, except that China is specifically named among the host locations affected by strict layoff regulations (Li et al., 2025; see Section 4.2).</w:t>
       </w:r>
     </w:p>
     <w:p>
@@ -4154,7 +4154,7 @@
     </w:p>
     <w:p>
       <w:r>
-        <w:t>The most striking pattern in the results is the predominance of the asset/capability category. The only barrier theme that is supported by direct case evidence, review syntheses and conceptual argument is the domestic skills and competence gap, and the physical counterpart — missing capacity, machinery and complementary tooling — is almost as broadly supported. The evidence thus suggests that the main challenge of reshoring is not so much about making the right decision, or even about paying for the reshoring, but about rebuilding productive capacity that has been lost over the years of offshoring. The most compelling evidence for this interpretation is the China-to-UK case, where the acquisition of the machinery was only the first step: the company had to acquire tooling, software, technical services, and train its workforce for about a year before production quality was acceptable (Pegoraro et al., 2022). In this case (Pegoraro et al., 2022), a single acquisition decision was followed by a twelve-month capability-building process, providing a more tangible example than any overall finding of the need for a separate analysis of the implementation stage. The general empirical evidence is in the same direction. Even after the reshoring decision, Swedish companies faced challenges related to lack of skills, equipment, and capacity (Li et al., 2025; Mirzaei et al., 2021), while reshoring companies in labour-intensive sectors experienced a shortage of skilled workforce (Di Mauro et al., 2018). The same cluster is found in review-level syntheses in the broader literature (Wiesmann et al., 2017; Ocicka, 2016). The results of Li et al. (2025), however, are presented at the level of their Swedish sample and not disaggregated by host country; they support the general pattern, not a China-specific claim.</w:t>
+        <w:t>The most striking pattern in the results is the predominance of the asset/capability category. The only barrier theme that is supported by direct case evidence, review syntheses and conceptual argument is the domestic skills and competence gap, and the physical counterpart — missing capacity, machinery and complementary tooling — is almost as broadly supported. The evidence thus suggests that the main challenge of reshoring is not so much about making the right decision, or even about paying for the reshoring, but about rebuilding productive capacity that has been lost over the years of offshoring. The most compelling evidence for this interpretation is the China-to-UK case, where the acquisition of the machinery was only the first step: the company had to acquire tooling, software, technical services, and train its workforce for about a year before production quality was acceptable (Pegoraro et al., 2022). In this case (Pegoraro et al., 2022), a single acquisition decision was followed by a twelve-month capability-building process, providing a more tangible example than any overall finding of the need for a separate analysis of the implementation stage. The general empirical evidence is in the same direction. Even after the reshoring decision, Swedish companies faced challenges related to lack of skills, equipment, and capacity (Li et al., 2025; Mirzaei et al., 2021), while reshoring companies in labour-intensive sectors experienced a shortage of skilled workforce (Di Mauro et al., 2018). The same cluster is found in review-level syntheses in the broader literature (Wiesmann et al., 2017; Ocicka, 2016). These results, however, are presented at the level of the Swedish sample and not disaggregated by host country (Li et al., 2025); they support the general pattern, not a China-specific claim.</w:t>
       </w:r>
     </w:p>
     <w:p>

</xml_diff>

<commit_message>
Split multi-citation sentences into one-claim-per-sentence, matching benchmark style
Went through every chapter and rewrote sentences that combined several
distinct sub-claims from different sources into one run-on sentence
(e.g. "X (A, Year), Y (B, Year), and Z (C, Year)"). Each sub-claim now
gets its own sentence with its own trailing citation, matching the
benchmark thesis's practice of one source per sentence. Left unsplit:
(1) corpus/evidence-type inventory sentences that count or categorise
sources rather than making discursive claims, and (2) sentences citing
the same single source twice for two related points, since neither
creates attribution ambiguity. No claim, hedge, or evidence-type
attribution was changed - only sentence boundaries. Citation-reference
consistency reconfirmed (35 references, all cited, no orphans).

Co-Authored-By: Claude Fable 5 <noreply@anthropic.com>
Claude-Session: https://claude.ai/code/session_01HJq9GBe6o3FZumGTYdfLDW
</commit_message>
<xml_diff>
--- a/thesis/COMPILED_DRAFT_FULL.docx
+++ b/thesis/COMPILED_DRAFT_FULL.docx
@@ -69,7 +69,7 @@
     </w:p>
     <w:p>
       <w:r>
-        <w:t>In this context, reshoring has gained more and more attention from companies, policymakers and academics (Barbieri et al., 2020; Pedroletti &amp; Ciabuschi, 2023). Some home countries have actively promoted the return of manufacturing, including the United States (Bolter &amp; Robey, 2020). Recent survey evidence shows that reshoring decisions are related to Industry 4.0 adoption, pandemic experiences, and made-in effects (Stentoft et al., 2025), and firm-level research indicates that the probability of reshoring is affected by home-country conditions (Wan et al., 2019). But a strong strategic argument for bringing production back does not imply that a firm has the resources and capabilities to make the move. Implementation may involve the firm having to re-establish manufacturing facilities, skills, and supplier networks in the home country. As mentioned in the literature, these implementation issues have been given much less attention than the reshoring decision itself (Ocicka, 2016; Pedroletti &amp; Ciabuschi, 2023). Barriers to implementation are a relevant and timely object of study, as many practical difficulties emerge during the implementation stage (Boffelli et al., 2021).</w:t>
+        <w:t>In this context, reshoring has gained more and more attention from companies, policymakers and academics (Barbieri et al., 2020; Pedroletti &amp; Ciabuschi, 2023). Some home countries have actively promoted the return of manufacturing, including the United States (Bolter &amp; Robey, 2020). Recent survey evidence shows that reshoring decisions are related to Industry 4.0 adoption, pandemic experiences, and made-in effects (Stentoft et al., 2025). Firm-level research also indicates that the probability of reshoring is affected by home-country conditions (Wan et al., 2019). But a strong strategic argument for bringing production back does not imply that a firm has the resources and capabilities to make the move. Implementation may involve the firm having to re-establish manufacturing facilities, skills, and supplier networks in the home country. As mentioned in the literature, these implementation issues have been given much less attention than the reshoring decision itself (Ocicka, 2016; Pedroletti &amp; Ciabuschi, 2023). Barriers to implementation are a relevant and timely object of study, as many practical difficulties emerge during the implementation stage (Boffelli et al., 2021).</w:t>
       </w:r>
     </w:p>
     <w:p>
@@ -222,17 +222,17 @@
     </w:p>
     <w:p>
       <w:r>
-        <w:t>The reshoring literature is based on a variety of theoretical approaches, and there is no single unified theory; there is currently no consensus on a "theory of reshoring", and previous studies have employed a range of different theoretical lenses (Wiesmann et al., 2017). The lenses of individual studies vary: one empirical analysis draws on Dunning's eclectic paradigm (Li et al., 2025), another applies a business-network perspective from internationalisation-process theory (Pedroletti, 2025), and a third builds on trade-theoretic work on de-globalisation and global value chains (D'Ambrosio &amp; Lavoratori, 2025).</w:t>
+        <w:t>The reshoring literature is based on a variety of theoretical approaches, and there is no single unified theory; there is currently no consensus on a "theory of reshoring", and previous studies have employed a range of different theoretical lenses (Wiesmann et al., 2017). The lenses of individual studies vary. One empirical analysis draws on Dunning's eclectic paradigm (Li et al., 2025). Another applies a business-network perspective from internationalisation-process theory (Pedroletti, 2025). A third builds on trade-theoretic work on de-globalisation and global value chains (D'Ambrosio &amp; Lavoratori, 2025).</w:t>
       </w:r>
     </w:p>
     <w:p>
       <w:r>
-        <w:t>In this plural background, the two theories used in this thesis are Transaction Cost Economics (TCE) and the Resource-Based View (RBV), as originally formulated (Williamson, 1985; Barney, 1991); if a reviewed study uses a different theory, this is indicated. Transaction Cost Economics directs attention to the costs of organising economic activity across firm and country boundaries, emphasising asset specificity, contractual safeguards, and the governance of exchange relationships (Williamson, 1985). This theory was not developed with reshoring in mind, and applying its concepts to the return of production is this thesis's own interpretation. From a TCE perspective, the exit side of implementation becomes visible: offshore arrangements embody committed investments and contractual obligations, and unwinding them carries real costs. Empirical evidence that is consistent with this logic includes the existence of strict layoff regulations in the host country, and locked investments that make it difficult to exit the host country quickly (Li et al., 2025), plant-closure fees and fiscal obligations reported in the review literature (Di Stefano &amp; Fratocchi, 2019), and the coordination burden that arises when production is split between home and host locations during a partial return (Pedroletti, 2025). Transaction-cost reasoning also points to hidden costs: sourcing decisions based on unit price are argued to systematically underestimate the total cost of offshore acquisition (Ocicka, 2016), and firms are reported to underestimate the operational adjustments that relocation requires (Boffelli et al., 2021).</w:t>
+        <w:t>In this plural background, the two theories used in this thesis are Transaction Cost Economics (TCE) and the Resource-Based View (RBV), as originally formulated (Williamson, 1985; Barney, 1991); if a reviewed study uses a different theory, this is indicated. Transaction Cost Economics directs attention to the costs of organising economic activity across firm and country boundaries, emphasising asset specificity, contractual safeguards, and the governance of exchange relationships (Williamson, 1985). This theory was not developed with reshoring in mind, and applying its concepts to the return of production is this thesis's own interpretation. From a TCE perspective, the exit side of implementation becomes visible: offshore arrangements embody committed investments and contractual obligations, and unwinding them carries real costs. Empirical evidence is consistent with this logic. Strict host-country layoff regulations and locked investments make it difficult to exit the host country quickly (Li et al., 2025). Plant-closure fees and fiscal obligations are also reported in the review literature (Di Stefano &amp; Fratocchi, 2019). A further cost arises from the coordination burden that appears when production is split between home and host locations during a partial return (Pedroletti, 2025). Transaction-cost reasoning also points to hidden costs. Sourcing decisions based on unit price are argued to systematically underestimate the total cost of offshore acquisition (Ocicka, 2016). Firms are also reported to underestimate the operational adjustments that relocation requires (Boffelli et al., 2021).</w:t>
       </w:r>
     </w:p>
     <w:p>
       <w:r>
-        <w:t>The Resource-Based View — the theory that competitive advantage rests on resources that are valuable, rare, imperfectly imitable and non-substitutable (Barney, 1991) — provides insights on the arrival side of implementation; as with TCE, this application to reshoring is the author's own interpretation. The RBV perspective suggests that the firm is a bundle of resources and capabilities, and reshoring will only be successful if the firm can rebuild or reacquire the productive resources (skills, machinery, routines, supplier relationships) needed by the home operation. The reshoring literature repeatedly mentions exactly such capability constraints: the loss of domestic manufacturing competences and capacity after long periods of offshoring (Wiesmann et al., 2017), the lack of specialized manpower faced by reshoring firms (Di Mauro et al., 2018), and the need to rebuild machinery, tooling, and workforce skills documented in case evidence (Pegoraro et al., 2022). Conceptual work complements this reading: reshoring is argued to present new fixed costs and capability requirements for firms, with existing value chains remaining "sticky" due to prior investment (D'Ambrosio &amp; Lavoratori, 2025). Combined, the two lenses are complementary: TCE helps to understand why it is expensive to leave the host country and the RBV helps to understand why it is difficult to re-establish production at home.</w:t>
+        <w:t>The Resource-Based View — the theory that competitive advantage rests on resources that are valuable, rare, imperfectly imitable and non-substitutable (Barney, 1991) — provides insights on the arrival side of implementation; as with TCE, this application to reshoring is the author's own interpretation. The RBV perspective suggests that the firm is a bundle of resources and capabilities, and reshoring will only be successful if the firm can rebuild or reacquire the productive resources (skills, machinery, routines, supplier relationships) needed by the home operation. The reshoring literature repeatedly mentions exactly such capability constraints. The loss of domestic manufacturing competences and capacity after long periods of offshoring is one recurring theme (Wiesmann et al., 2017). Reshoring firms also face a lack of specialised manpower (Di Mauro et al., 2018). Case evidence further documents the need to rebuild machinery, tooling, and workforce skills (Pegoraro et al., 2022). Conceptual work complements this reading: reshoring is argued to present new fixed costs and capability requirements for firms, with existing value chains remaining "sticky" due to prior investment (D'Ambrosio &amp; Lavoratori, 2025). Combined, the two lenses are complementary: TCE helps to understand why it is expensive to leave the host country and the RBV helps to understand why it is difficult to re-establish production at home.</w:t>
       </w:r>
     </w:p>
     <w:p>
@@ -245,7 +245,7 @@
     </w:p>
     <w:p>
       <w:r>
-        <w:t>This thesis makes a distinction between the motivations for reshoring and the challenges of reshoring. The literature on drivers is relatively well developed (Wiesmann et al., 2017). Offshoring is concluded to be primarily motivated by cost reduction, while backshoring typically occurs as a result of a strategic reorientation towards customer perceived value, and the return is not necessarily a managerial error, but rather a strategic evolution (Di Mauro et al., 2018). Quantitative firm-level evidence links reshoring decisions to home-country conditions (Wan et al., 2019) and to Industry 4.0 adoption, pandemic experience, and made-in effects (Stentoft et al., 2025), while survey and case research has explored the link between digital-technology adoption and backshoring decisions (Kamp &amp; Gibaja, 2021).</w:t>
+        <w:t>This thesis makes a distinction between the motivations for reshoring and the challenges of reshoring. The literature on drivers is relatively well developed (Wiesmann et al., 2017). Offshoring is concluded to be primarily motivated by cost reduction, while backshoring typically occurs as a result of a strategic reorientation towards customer perceived value, and the return is not necessarily a managerial error, but rather a strategic evolution (Di Mauro et al., 2018). Quantitative firm-level evidence links reshoring decisions to home-country conditions (Wan et al., 2019). Other quantitative evidence links reshoring decisions to Industry 4.0 adoption, pandemic experience, and made-in effects (Stentoft et al., 2025). Survey and case research has also explored the link between digital-technology adoption and backshoring decisions (Kamp &amp; Gibaja, 2021).</w:t>
       </w:r>
     </w:p>
     <w:p>
@@ -278,7 +278,7 @@
     </w:p>
     <w:p>
       <w:r>
-        <w:t>The research gap is identified by three limitations of this body of knowledge. The most basic is fragmentation: individual studies identify individual obstacles, but consolidated, firm-level syntheses focused specifically on implementation are rare, and the implementation stage remains under-researched compared with the reshoring decision (Ocicka, 2016; Pedroletti &amp; Ciabuschi, 2023). The evidence is also diverse in nature, with direct observations of cases, review-level aggregations, and conceptual arguments all being cited as evidence, but each of these types of evidence is different and thus must be interpreted differently. Most important for this thesis, the literature is not disaggregated in an Asia-specific manner. Although Asia is the primary offshore manufacturing destination (Gao et al., 2022), most studies report barriers at the sample level, and do not differentiate between barriers that relate to the return from Asian host countries. There are a few cases of direct implementation evidence, such as a China-to-UK case that documents skills, machinery and ramp-up difficulties (Pegoraro et al., 2022) and a China-to-Italy case that documents supplier dependence and coordination burdens in a partial return (Pedroletti, 2025). The four categories in this thesis — regulatory/institutional, cultural/organisational, cost/operational, and asset/capability barriers — are designed to bring together this fragmented evidence at the firm level while maintaining the distinction between empirical, review, conceptual, and Asia-specific evidence.</w:t>
+        <w:t>The research gap is identified by three limitations of this body of knowledge. The most basic is fragmentation: individual studies identify individual obstacles, but consolidated, firm-level syntheses focused specifically on implementation are rare, and the implementation stage remains under-researched compared with the reshoring decision (Ocicka, 2016; Pedroletti &amp; Ciabuschi, 2023). The evidence is also diverse in nature, with direct observations of cases, review-level aggregations, and conceptual arguments all being cited as evidence, but each of these types of evidence is different and thus must be interpreted differently. Most important for this thesis, the literature is not disaggregated in an Asia-specific manner. Although Asia is the primary offshore manufacturing destination (Gao et al., 2022), most studies report barriers at the sample level, and do not differentiate between barriers that relate to the return from Asian host countries. There are a few cases of direct implementation evidence. One is a China-to-UK case that documents skills, machinery and ramp-up difficulties (Pegoraro et al., 2022). Another is a China-to-Italy case that documents supplier dependence and coordination burdens in a partial return (Pedroletti, 2025). The four categories in this thesis — regulatory/institutional, cultural/organisational, cost/operational, and asset/capability barriers — are designed to bring together this fragmented evidence at the firm level while maintaining the distinction between empirical, review, conceptual, and Asia-specific evidence.</w:t>
       </w:r>
     </w:p>
     <w:p>
@@ -2083,12 +2083,12 @@
     </w:p>
     <w:p>
       <w:r>
-        <w:t>There are 3 types of contributing evidence. There are four main empirical studies (Boffelli et al., 2021; Li et al., 2025; Pegoraro et al., 2022; Pedroletti, 2025), and two auxiliary empirical studies (Di Mauro et al., 2018; Mirzaei et al., 2021), with a third supporting empirical study (Robinson &amp; Hsieh, 2016) providing only contextual evidence. The evidence from literature is derived from six sources (Pedroletti &amp; Ciabuschi, 2023; Wiesmann et al., 2017; Espíndola et al., 2023; Di Stefano &amp; Fratocchi, 2019; Ocicka, 2016; Bilbao-Ubillos et al., 2024), while conceptual argument from additional two sources (D'Ambrosio &amp; Lavoratori, 2025; Gupta et al., 2023). The types are listed separately in each section, to avoid consolidating them into a single frequency since the evidential weight of a case observation is different from that of a review finding, or a conceptual argument. Both the two main empirical studies (Pegoraro et al., 2022; Pedroletti, 2025) have a single case design and the results are presented as case studies, not generalisations.</w:t>
+        <w:t>There are 3 types of contributing evidence. There are four main empirical studies (Boffelli et al., 2021; Li et al., 2025; Pegoraro et al., 2022; Pedroletti, 2025) and two auxiliary empirical studies (Di Mauro et al., 2018; Mirzaei et al., 2021). A third supporting empirical study (Robinson &amp; Hsieh, 2016) provides only contextual evidence. The evidence from literature is derived from six sources (Pedroletti &amp; Ciabuschi, 2023; Wiesmann et al., 2017; Espíndola et al., 2023; Di Stefano &amp; Fratocchi, 2019; Ocicka, 2016; Bilbao-Ubillos et al., 2024), while conceptual argument comes from two further sources (D'Ambrosio &amp; Lavoratori, 2025; Gupta et al., 2023). The types are listed separately in each section, to avoid consolidating them into a single frequency since the evidential weight of a case observation is different from that of a review finding, or a conceptual argument. Both the two main empirical studies (Pegoraro et al., 2022; Pedroletti, 2025) have a single case design and the results are presented as case studies, not generalisations.</w:t>
       </w:r>
     </w:p>
     <w:p>
       <w:r>
-        <w:t>There are few examples of direct implementation evidence specific to Asia. It is based on two single-cases; the first concerns a case from China to UK (Pegoraro et al., 2022), and the second concerns a partial reshoring from China to Italy (Pedroletti, 2025). Two of the four case firms moved production out of China in the multi-case study, although the findings are not always attributed to the individual cases (Di Mauro et al., 2018). The four fashion cases are, by contrast, Romanian, Moroccan, Croatian and Hungarian host-areas, so the results of this implementation enter the synthesis as general, rather than Asia-specific, evidence (Boffelli et al., 2021). The Nordic/Swedish evidence is likewise presented as general, except that China is specifically named among the host locations affected by strict layoff regulations (Li et al., 2025; see Section 4.2).</w:t>
+        <w:t>There are few examples of direct implementation evidence specific to Asia. It is based on two single cases. The first concerns a case from China to UK (Pegoraro et al., 2022). The second concerns a partial reshoring from China to Italy (Pedroletti, 2025). Two of the four case firms moved production out of China in the multi-case study, although the findings are not always attributed to the individual cases (Di Mauro et al., 2018). The four fashion cases are, by contrast, Romanian, Moroccan, Croatian and Hungarian host-areas, so the results of this implementation enter the synthesis as general, rather than Asia-specific, evidence (Boffelli et al., 2021). The Nordic/Swedish evidence is likewise presented as general, except that China is specifically named among the host locations affected by strict layoff regulations (Li et al., 2025; see Section 4.2).</w:t>
       </w:r>
     </w:p>
     <w:p>
@@ -4037,7 +4037,7 @@
     </w:p>
     <w:p>
       <w:r>
-        <w:t>The most direct evidence in this category relates to the implementation stage itself. In four fashion-industry relocation cases, the failure of relocation initiatives was directly linked to errors in the implementation phase, with insufficient internal organisational readiness, managerial behavioural biases, and learning through trial-and-error during implementation identified as implementation-stage problems; the central conclusion is that reshoring succeeds only if firms manage implementation correctly (Boffelli et al., 2021). These findings are general implementation evidence for the cases of Romanian, Moroccan, Croatian and Hungarian host locations. The literature reviewed reveals related organisational weaknesses: the immaturity of firms' reshoring processes and internal communication gaps (Wiesmann et al., 2017), and, conceptually, a managerial-capability gap has been argued to limit reshoring, especially for smaller firms (D'Ambrosio &amp; Lavoratori, 2025).</w:t>
+        <w:t>The most direct evidence in this category relates to the implementation stage itself. In four fashion-industry relocation cases, the failure of relocation initiatives was directly linked to errors in the implementation phase, with insufficient internal organisational readiness, managerial behavioural biases, and learning through trial-and-error during implementation identified as implementation-stage problems; the central conclusion is that reshoring succeeds only if firms manage implementation correctly (Boffelli et al., 2021). These findings are general implementation evidence for the cases of Romanian, Moroccan, Croatian and Hungarian host locations. The literature reviewed reveals related organisational weaknesses. The immaturity of firms' reshoring processes and internal communication gaps is one such weakness (Wiesmann et al., 2017). Conceptually, a managerial-capability gap has also been argued to limit reshoring, especially for smaller firms (D'Ambrosio &amp; Lavoratori, 2025).</w:t>
       </w:r>
     </w:p>
     <w:p>
@@ -4057,7 +4057,7 @@
     </w:p>
     <w:p>
       <w:r>
-        <w:t>Finally, an organisational-adaptation burden is consistently reported at review level where reshoring is technology-enabled. Digital adaptation is not just about the acquisition of technology but also involves altering routines, responsibilities, information flows, supplier and customer relationships, and the lack of digital technical skills (Bilbao-Ubillos et al., 2024); technology-implementation readiness and the absence of a valid business model preceding the technology choice are also reported among barriers at the intersection of reshoring and Industry 4.0 (Espíndola et al., 2023). Industry 4.0 is conceptually presented as a dual phenomenon, both as an enabler of reshoring and as a phenomenon that requires new skills, investments, integration and organisational adaptation (Gupta et al., 2023), and an automation-scale threshold has been argued, whereby automation does not automatically facilitate reshoring (D'Ambrosio &amp; Lavoratori, 2025). This theme is not directly observed in the sample, as there is no direct empirical study.</w:t>
+        <w:t>Finally, an organisational-adaptation burden is consistently reported at review level where reshoring is technology-enabled. Digital adaptation is not just about the acquisition of technology but also involves altering routines, responsibilities, information flows, supplier and customer relationships, and the lack of digital technical skills (Bilbao-Ubillos et al., 2024). Technology-implementation readiness and the absence of a valid business model preceding the technology choice are also reported among barriers at the intersection of reshoring and Industry 4.0 (Espíndola et al., 2023). Industry 4.0 is conceptually presented as a dual phenomenon, both as an enabler of reshoring and as a phenomenon that requires new skills, investments, integration and organisational adaptation (Gupta et al., 2023). An automation-scale threshold has also been argued, whereby automation does not automatically facilitate reshoring (D'Ambrosio &amp; Lavoratori, 2025). This theme is not directly observed in the sample, as there is no direct empirical study.</w:t>
       </w:r>
     </w:p>
     <w:p>
@@ -4070,17 +4070,17 @@
     </w:p>
     <w:p>
       <w:r>
-        <w:t>The first cost/operational theme is the lack of domestic supply base: even after production is resumed, companies can continue to rely on foreign suppliers due to the absence of domestic materials, specialised components, supplier know-how, or adequate scale (Mirzaei et al., 2021). A shortage of suppliers in high-cost home countries and the need to rebuild suppliers are also identified as challenges associated with backshoring, although the specific cases are not attributed individually among the four cases in that study, two of which were backshored from China (Di Mauro et al., 2018). The theme is echoed in the review literature: weak home-country supplier capacity, local networks, and supply-chain integration are reported as barriers (Wiesmann et al., 2017), and the erosion of domestic supplier networks is identified as an implementation concern discussed in the reshoring literature (Ocicka, 2016). A domestic quality-supplier gap is also conceptually noted (Gupta et al., 2023).</w:t>
+        <w:t>The first cost/operational theme is the lack of domestic supply base: even after production is resumed, companies can continue to rely on foreign suppliers due to the absence of domestic materials, specialised components, supplier know-how, or adequate scale (Mirzaei et al., 2021). A shortage of suppliers in high-cost home countries and the need to rebuild suppliers are also identified as challenges associated with backshoring, although the specific cases are not attributed individually among the four cases in that study, two of which were backshored from China (Di Mauro et al., 2018). The theme is echoed in the review literature. Weak home-country supplier capacity, local networks, and supply-chain integration are reported as barriers (Wiesmann et al., 2017). The erosion of domestic supplier networks is also identified as an implementation concern discussed in the reshoring literature (Ocicka, 2016). A domestic quality-supplier gap is also conceptually noted (Gupta et al., 2023).</w:t>
       </w:r>
     </w:p>
     <w:p>
       <w:r>
-        <w:t>The return creates new costs: cost miscalculation occurred during or after relocation among the Swedish companies studied (Li et al., 2025). Implementation-cost escalation and cost-coordination complexity are among the barriers at the reshoring-Industry 4.0 intersection at the review level (Espíndola et al., 2023). The new fixed costs of reshoring — building or rebuilding a plant, buying or rebuilding equipment and automation, hiring and training workers, and rebuilding a domestic supplier network — are conceptually described as among the most direct implementation barriers (D'Ambrosio &amp; Lavoratori, 2025), while switching and reconfiguration costs, including duplicate operations during the transition, are identified as a further cost barrier at the conceptual level (Gupta et al., 2023). These new costs of the return are in addition to the sunk costs of the offshore operation, which are reported separately in Section 4.5.</w:t>
+        <w:t>The return creates new costs: cost miscalculation occurred during or after relocation among the Swedish companies studied (Li et al., 2025). Implementation-cost escalation and cost-coordination complexity are among the barriers at the reshoring-Industry 4.0 intersection at the review level (Espíndola et al., 2023). The new fixed costs of reshoring — building or rebuilding a plant, buying or rebuilding equipment and automation, hiring and training workers, and rebuilding a domestic supplier network — are conceptually described as among the most direct implementation barriers (D'Ambrosio &amp; Lavoratori, 2025). Switching and reconfiguration costs, including duplicate operations during the transition, are also identified as a further cost barrier at the conceptual level (Gupta et al., 2023). These new costs of the return are in addition to the sunk costs of the offshore operation, which are reported separately in Section 4.5.</w:t>
       </w:r>
     </w:p>
     <w:p>
       <w:r>
-        <w:t>A high cost home environment, in turn, does not preclude physical relocation, but rather limits the viability and extent of reshoring. Labour cost, along with high energy and overhead costs, was identified as a challenge by all five case companies studied (Mirzaei et al., 2021); labour, overhead, and total costs were also among the most common barriers mentioned by the Swedish companies studied (Li et al., 2025). The economic viability and extent of the return is conceptually said to be influenced by a home-country factor-cost disadvantage (D'Ambrosio &amp; Lavoratori, 2025). This theme is mentioned here only as a limitation on re-established domestic production, but not as a reason for the original offshoring decision.</w:t>
+        <w:t>A high cost home environment, in turn, does not preclude physical relocation, but rather limits the viability and extent of reshoring. Labour cost, along with high energy and overhead costs, was identified as a challenge by all five case companies studied (Mirzaei et al., 2021). Labour, overhead, and total costs were also among the most common barriers mentioned by the Swedish companies studied in a related survey (Li et al., 2025). The economic viability and extent of the return is conceptually said to be influenced by a home-country factor-cost disadvantage (D'Ambrosio &amp; Lavoratori, 2025). This theme is mentioned here only as a limitation on re-established domestic production, but not as a reason for the original offshoring decision.</w:t>
       </w:r>
     </w:p>
     <w:p>
@@ -4103,22 +4103,22 @@
     </w:p>
     <w:p>
       <w:r>
-        <w:t>The most widely cited barrier in the corpus is the loss of domestic skilled labour and manufacturing competence, which is found in direct case evidence, throughout the review literature and in conceptual argument. In the China-to-UK case, the company did not have the knowledge to make the part on its own, and the learning curve — getting the equipment to work, training employees, gaining experience, and achieving acceptable quality — took about a year (Pegoraro et al., 2022). An internal competence gap, described as competencies lost over years of offshoring, was found among Swedish firms (Li et al., 2025), and a domestic skilled-labour shortage — loss of tacit knowledge, lack of core manufacturing competencies, and high training time and cost — was found among Swedish firms in a related study (Mirzaei et al., 2021). A lack of specialised manpower and loss of domestic competences are also identified as constraints in implementing the return (Di Mauro et al., 2018). A shortage of skilled labour (Wiesmann et al., 2017), a technical-skills shortage and a generational manufacturing-skills gap (Ocicka, 2016), and a digital technical-skills shortage (Bilbao-Ubillos et al., 2024) are reported at the review level, while a domestic skilled-workforce shortage (D'Ambrosio &amp; Lavoratori, 2025) and a domestic labour-availability gap (Gupta et al., 2023) are argued conceptually.</w:t>
+        <w:t>The most widely cited barrier in the corpus is the loss of domestic skilled labour and manufacturing competence, which is found in direct case evidence, throughout the review literature and in conceptual argument. In the China-to-UK case, the company did not have the knowledge to make the part on its own, and the learning curve — getting the equipment to work, training employees, gaining experience, and achieving acceptable quality — took about a year (Pegoraro et al., 2022). An internal competence gap, described as competencies lost over years of offshoring, was found among Swedish firms (Li et al., 2025). A domestic skilled-labour shortage — loss of tacit knowledge, lack of core manufacturing competencies, and high training time and cost — was also found among Swedish firms in a related study (Mirzaei et al., 2021). A lack of specialised manpower and loss of domestic competences are also identified as constraints in implementing the return (Di Mauro et al., 2018). At the review level, a shortage of skilled labour is one reported constraint (Wiesmann et al., 2017). A technical-skills shortage and a generational manufacturing-skills gap are reported similarly (Ocicka, 2016). Review evidence also points to a digital technical-skills shortage (Bilbao-Ubillos et al., 2024). A domestic skilled-workforce shortage is argued conceptually (D'Ambrosio &amp; Lavoratori, 2025). A domestic labour-availability gap is argued on the same conceptual grounds (Gupta et al., 2023).</w:t>
       </w:r>
     </w:p>
     <w:p>
       <w:r>
-        <w:t>The physical aspect of capability rebuilding is closely related. As in the case of China to UK, the re-establishment of production is not just about purchasing a machine, but also about identifying the required technology, finding and integrating the appropriate equipment, and acquiring tooling, tooling suppliers, software, technical support, and specialised services, that is, rebuilding an interconnected production system (Pegoraro et al., 2022). Even after the decision to reshore, Swedish companies reported a domestic capacity shortage (Li et al., 2025), and a domestic production-capacity gap — insufficient facilities, equipment limits, and investment resources — was reported in a related study of Swedish firms (Mirzaei et al., 2021). The review literature documents a domestic capacity shortage and an infrastructure lock-out after a long period of offshoring (Wiesmann et al., 2017), and the theme is conceptually mentioned in the new-fixed-costs argument (D'Ambrosio &amp; Lavoratori, 2025) and in a conceptually noted domestic infrastructure gap (Gupta et al., 2023).</w:t>
+        <w:t>The physical aspect of capability rebuilding is closely related. As in the case of China to UK, the re-establishment of production is not just about purchasing a machine, but also about identifying the required technology, finding and integrating the appropriate equipment, and acquiring tooling, tooling suppliers, software, technical support, and specialised services, that is, rebuilding an interconnected production system (Pegoraro et al., 2022). Even after the decision to reshore, Swedish companies reported a domestic capacity shortage (Li et al., 2025). A domestic production-capacity gap — insufficient facilities, equipment limits, and investment resources — was also reported in a related study of Swedish firms (Mirzaei et al., 2021). The review literature documents a domestic capacity shortage and an infrastructure lock-out after a long period of offshoring (Wiesmann et al., 2017). The theme is also mentioned conceptually in the new-fixed-costs argument (D'Ambrosio &amp; Lavoratori, 2025). A domestic infrastructure gap is separately noted on similar conceptual grounds (Gupta et al., 2023).</w:t>
       </w:r>
     </w:p>
     <w:p>
       <w:r>
-        <w:t>Capability constraints are not just within the firm's boundaries: specialised capabilities that are located with the host-country supplier may be hard to repatriate. In the China-to-Italy case (Pedroletti, 2025), the inability to fully replace the Chinese network was the reason for partial reshoring, as the firm lacked the production knowledge, experience with the components, specialised sourcing skills, and suitable domestic suppliers. The gap was not in the general ability to manufacture domestically, but in this particular and specialised ability. Swedish firms were also found to be dependent on suppliers and intellectual property, meaning that the firm does not have full control over the rights to a component or technology and cannot simply shift production home (Li et al., 2025). At review level, host-supplier dependence (Wiesmann et al., 2017) and offshore knowledge dependence (Bilbao-Ubillos et al., 2024) are reported, and knowledge-transfer ambiguity — knowledge residing with offshore employees, subsidiaries, suppliers, or the host-country network — is conceptually identified (Gupta et al., 2023).</w:t>
+        <w:t>Capability constraints are not just within the firm's boundaries: specialised capabilities that are located with the host-country supplier may be hard to repatriate. In the China-to-Italy case (Pedroletti, 2025), the inability to fully replace the Chinese network was the reason for partial reshoring, as the firm lacked the production knowledge, experience with the components, specialised sourcing skills, and suitable domestic suppliers. The gap was not in the general ability to manufacture domestically, but in this particular and specialised ability. Swedish firms were also found to be dependent on suppliers and intellectual property, meaning that the firm does not have full control over the rights to a component or technology and cannot simply shift production home (Li et al., 2025). At review level, host-supplier dependence is reported (Wiesmann et al., 2017). Offshore knowledge dependence is reported similarly (Bilbao-Ubillos et al., 2024). Knowledge-transfer ambiguity — knowledge residing with offshore employees, subsidiaries, suppliers, or the host-country network — is identified at the conceptual level (Gupta et al., 2023).</w:t>
       </w:r>
     </w:p>
     <w:p>
       <w:r>
-        <w:t>Established value chains also exhibit inertia. Offshore sunk-cost inertia is reported at review level (Bilbao-Ubillos et al., 2024), and value chains are conceptually argued to be "sticky", especially for large firms, due to sunk investment, established supplier relationships, specialised infrastructure, and location-specific knowledge (D'Ambrosio &amp; Lavoratori, 2025). This theme is based on review and conceptual evidence, and the sunk costs offshore described in this theme are different from the new fixed costs of the return described in Section 4.4.</w:t>
+        <w:t>Established value chains also exhibit inertia. Offshore sunk-cost inertia is reported at review level (Bilbao-Ubillos et al., 2024). Value chains are also conceptually argued to be "sticky", especially for large firms, due to sunk investment, established supplier relationships, specialised infrastructure, and location-specific knowledge (D'Ambrosio &amp; Lavoratori, 2025). This theme is based on review and conceptual evidence, and the sunk costs offshore described in this theme are different from the new fixed costs of the return described in Section 4.4.</w:t>
       </w:r>
     </w:p>
     <w:p>
@@ -4154,12 +4154,12 @@
     </w:p>
     <w:p>
       <w:r>
-        <w:t>The most striking pattern in the results is the predominance of the asset/capability category. The only barrier theme that is supported by direct case evidence, review syntheses and conceptual argument is the domestic skills and competence gap, and the physical counterpart — missing capacity, machinery and complementary tooling — is almost as broadly supported. The evidence thus suggests that the main challenge of reshoring is not so much about making the right decision, or even about paying for the reshoring, but about rebuilding productive capacity that has been lost over the years of offshoring. The most compelling evidence for this interpretation is the China-to-UK case, where the acquisition of the machinery was only the first step: the company had to acquire tooling, software, technical services, and train its workforce for about a year before production quality was acceptable (Pegoraro et al., 2022). In this case (Pegoraro et al., 2022), a single acquisition decision was followed by a twelve-month capability-building process, providing a more tangible example than any overall finding of the need for a separate analysis of the implementation stage. The general empirical evidence is in the same direction. Even after the reshoring decision, Swedish companies faced challenges related to lack of skills, equipment, and capacity (Li et al., 2025; Mirzaei et al., 2021), while reshoring companies in labour-intensive sectors experienced a shortage of skilled workforce (Di Mauro et al., 2018). The same cluster is found in review-level syntheses in the broader literature (Wiesmann et al., 2017; Ocicka, 2016). These results, however, are presented at the level of the Swedish sample and not disaggregated by host country (Li et al., 2025); they support the general pattern, not a China-specific claim.</w:t>
+        <w:t>The most striking pattern in the results is the predominance of the asset/capability category. The only barrier theme that is supported by direct case evidence, review syntheses and conceptual argument is the domestic skills and competence gap, and the physical counterpart — missing capacity, machinery and complementary tooling — is almost as broadly supported. The evidence thus suggests that the main challenge of reshoring is not so much about making the right decision, or even about paying for the reshoring, but about rebuilding productive capacity that has been lost over the years of offshoring. The most compelling evidence for this interpretation is the China-to-UK case, where the acquisition of the machinery was only the first step: the company had to acquire tooling, software, technical services, and train its workforce for about a year before production quality was acceptable (Pegoraro et al., 2022). In this case (Pegoraro et al., 2022), a single acquisition decision was followed by a twelve-month capability-building process, providing a more tangible example than any overall finding of the need for a separate analysis of the implementation stage. The general empirical evidence is in the same direction. Even after the reshoring decision, Swedish companies faced challenges related to lack of skills, equipment, and capacity (Li et al., 2025; Mirzaei et al., 2021). Reshoring companies in labour-intensive sectors also experienced a shortage of skilled workforce (Di Mauro et al., 2018). The same cluster is found in review-level syntheses in the broader literature (Wiesmann et al., 2017; Ocicka, 2016). These results, however, are presented at the level of the Swedish sample and not disaggregated by host country (Li et al., 2025); they support the general pattern, not a China-specific claim.</w:t>
       </w:r>
     </w:p>
     <w:p>
       <w:r>
-        <w:t>This capability reading is the reason for the fact that reshoring implementation is not offshoring in reverse. As production shifted to Asia, production shifted to places where suppliers, skilled labour and infrastructure were already in place; the offshoring firm could simply connect to an existing manufacturing ecosystem (Yang, 2016). The other way around is true for the returning company: the domestic ecosystem it has left behind has partially vanished. This is referred to in the review literature as infrastructure lock-out and the hollowing-out of domestic supplier bases (Wiesmann et al., 2017; Ocicka, 2016), and in the conceptual literature as the stickiness of established value chains (D'Ambrosio &amp; Lavoratori, 2025). This review also notes that the asymmetry is active on both sides of the move simultaneously. On the exit side, layoff regulations in the host country, locked investments, and exit costs make exit slow and costly (Li et al., 2025; Di Stefano &amp; Fratocchi, 2019). On the receiving end, the company needs to re-establish skills, equipment and supplier relationships at the cost of a high-wage economy (Mirzaei et al., 2021). Thus a firm may find itself in a situation where it is expensive to leave the host country, but the home country is not prepared to accept it.</w:t>
+        <w:t>This capability reading is the reason for the fact that reshoring implementation is not offshoring in reverse. As production shifted to Asia, production shifted to places where suppliers, skilled labour and infrastructure were already in place; the offshoring firm could simply connect to an existing manufacturing ecosystem (Yang, 2016). The other way around is true for the returning company: the domestic ecosystem it has left behind has partially vanished. This is referred to in the review literature as infrastructure lock-out and the hollowing-out of domestic supplier bases (Wiesmann et al., 2017; Ocicka, 2016). The conceptual literature refers to the same asymmetry as the stickiness of established value chains (D'Ambrosio &amp; Lavoratori, 2025). This review also notes that the asymmetry is active on both sides of the move simultaneously. On the exit side, layoff regulations in the host country, locked investments, and exit costs make exit slow and costly (Li et al., 2025; Di Stefano &amp; Fratocchi, 2019). On the receiving end, the company needs to re-establish skills, equipment and supplier relationships at the cost of a high-wage economy (Mirzaei et al., 2021). Thus a firm may find itself in a situation where it is expensive to leave the host country, but the home country is not prepared to accept it.</w:t>
       </w:r>
     </w:p>
     <w:p>
@@ -4174,7 +4174,7 @@
     </w:p>
     <w:p>
       <w:r>
-        <w:t>There are two qualifications to all these interpretations. The direct evidence that is truly Asia-specific is limited to two documented cases: one automotive supplier that returned from China to the United Kingdom (Pegoraro et al., 2022) and one manufacturer that partially returned from China to Italy (Pedroletti, 2025). As in the general pattern, these cases focus on capability rebuilding and supplier dependence, but two cases in one host country cannot be interpreted as representing Asian markets in general, and nothing here should be interpreted as a statement about, say, returns from Vietnam, India, or Indonesia. The second qualification relates to the thinness of the regulatory/institutional category, which is the least supported by direct empirical evidence. It could be because it is truly unimportant, but it could also be because of the makeup of the evidence base. The one study that systematically searched for them found exit-side regulatory constraints (Li et al., 2025), and they are also mentioned in the review literature (Di Stefano &amp; Fratocchi, 2019), suggesting that they are not absent but under-observed. The categories are weighted here according to the evidence they have, but it is recognized that absence of evidence is not evidence of absence.</w:t>
+        <w:t>There are two qualifications to all these interpretations. The direct evidence that is truly Asia-specific is limited to two documented cases. One is an automotive supplier that returned from China to the United Kingdom (Pegoraro et al., 2022). The other is a manufacturer that partially returned from China to Italy (Pedroletti, 2025). As in the general pattern, these cases focus on capability rebuilding and supplier dependence, but two cases in one host country cannot be interpreted as representing Asian markets in general, and nothing here should be interpreted as a statement about, say, returns from Vietnam, India, or Indonesia. The second qualification relates to the thinness of the regulatory/institutional category, which is the least supported by direct empirical evidence. It could be because it is truly unimportant, but it could also be because of the makeup of the evidence base. The one study that systematically searched for them found exit-side regulatory constraints (Li et al., 2025). They are also mentioned in the review literature (Di Stefano &amp; Fratocchi, 2019), suggesting that they are not absent but under-observed. The categories are weighted here according to the evidence they have, but it is recognized that absence of evidence is not evidence of absence.</w:t>
       </w:r>
     </w:p>
     <w:p>
@@ -4192,22 +4192,22 @@
     </w:p>
     <w:p>
       <w:r>
-        <w:t>The exit-side findings have a common logic from a Transaction Cost Economics (TCE) perspective (Williamson, 1985). Offshore arrangements are resistant to unwinding because of asset specificity, which is investment tied to a specific exchange relationship (Williamson, 1985). In transaction-cost terms, the locked investments and significant exit costs reported among Swedish firms (Li et al., 2025), the closure fees and layoff constraints reported in the review literature (Di Stefano &amp; Fratocchi, 2019), and the contractual and intellectual-property constraints that prevent a firm from simply relocating production it does not fully control (Li et al., 2025) are all the price of dismantling governance structures built around specific assets. The hybrid configuration, which involves a partial return, is exactly the kind of production split that involves ongoing transaction costs: coordinating production between home and host locations, with technically interdependent components moving back and forth. The small-numbers dependency that transaction-cost reasoning associates with specific assets is reflected in the reduced bargaining power towards fewer, non-substitutable suppliers reported in the China-to-Italy case (Pedroletti, 2025). Finally, bounded rationality provides an explanation for the miscalculation results: firms underestimated operational changes (Boffelli et al., 2021) and faced cost surprises when relocating (Li et al., 2025) not because they were negligent, but because they could not have all the information required to make a full ex ante calculation of an implementation process. Unless explicitly used in the studies, these are interpretations made by this thesis; the studies reviewed did not test transaction-cost hypotheses, and this reading does not attempt to validate the theory.</w:t>
+        <w:t>The exit-side findings have a common logic from a Transaction Cost Economics (TCE) perspective (Williamson, 1985). Offshore arrangements are resistant to unwinding because of asset specificity, which is investment tied to a specific exchange relationship (Williamson, 1985). In transaction-cost terms, the locked investments and significant exit costs reported among Swedish firms are one price of dismantling governance structures built around specific assets (Li et al., 2025). The closure fees and layoff constraints reported in the review literature are another (Di Stefano &amp; Fratocchi, 2019). So are the contractual and intellectual-property constraints that prevent a firm from simply relocating production it does not fully control (Li et al., 2025). The hybrid configuration, which involves a partial return, is exactly the kind of production split that involves ongoing transaction costs: coordinating production between home and host locations, with technically interdependent components moving back and forth. The small-numbers dependency that transaction-cost reasoning associates with specific assets is reflected in the reduced bargaining power towards fewer, non-substitutable suppliers reported in the China-to-Italy case (Pedroletti, 2025). Finally, bounded rationality provides an explanation for the miscalculation results. Firms underestimated operational changes, not because they were negligent, but because they could not have all the information required to make a full ex ante calculation of an implementation process (Boffelli et al., 2021). The same logic explains why firms faced cost surprises when relocating (Li et al., 2025). Unless explicitly used in the studies, these are interpretations made by this thesis; the studies reviewed did not test transaction-cost hypotheses, and this reading does not attempt to validate the theory.</w:t>
       </w:r>
     </w:p>
     <w:p>
       <w:r>
-        <w:t>The findings from the arrival side are similarly coherent from a Resource-Based View perspective (Barney, 1991). The capabilities that offshoring firms allowed to erode — manufacturing skills, tacit production knowledge, supplier relationships, and functioning regional ecosystems — are the kinds of resources that the theory says are hard to imitate or acquire quickly: they are developed through experience, they are embedded in people and routines, and they rely on complementary assets (Barney, 1991). This is why the most consistent finding of the review is that capability gaps cannot be filled with a purchase. The China-to-UK case illustrates this in miniature: the machine could be purchased, but it took a year of training and error-elimination to be able to operate it productively (Pegoraro et al., 2022); and the general evidence on skills shortages, generational knowledge loss, and supplier-network gaps (Di Mauro et al., 2018; Mirzaei et al., 2021; Ocicka, 2016) shows the same logic at sample level. The availability of skilled labour, specialised suppliers, and supporting institutions in the home region (Pegoraro et al., 2022) acts as a complementary resource endowment that individual firms can access but not produce on their own, which also sheds light on the regional ecosystem findings.</w:t>
+        <w:t>The findings from the arrival side are similarly coherent from a Resource-Based View perspective (Barney, 1991). The capabilities that offshoring firms allowed to erode — manufacturing skills, tacit production knowledge, supplier relationships, and functioning regional ecosystems — are the kinds of resources that the theory says are hard to imitate or acquire quickly: they are developed through experience, they are embedded in people and routines, and they rely on complementary assets (Barney, 1991). This is why the most consistent finding of the review is that capability gaps cannot be filled with a purchase. The China-to-UK case illustrates this in miniature: the machine could be purchased, but it took a year of training and error-elimination to be able to operate it productively (Pegoraro et al., 2022). The general evidence on skills shortages, generational knowledge loss, and supplier-network gaps shows the same logic at sample level (Di Mauro et al., 2018; Mirzaei et al., 2021; Ocicka, 2016). The availability of skilled labour, specialised suppliers, and supporting institutions in the home region (Pegoraro et al., 2022) acts as a complementary resource endowment that individual firms can access but not produce on their own, which also sheds light on the regional ecosystem findings.</w:t>
       </w:r>
     </w:p>
     <w:p>
       <w:r>
-        <w:t>The two views are most effective when used together, as several barriers are both transaction-cost and capability issues. The most obvious example is host-supplier dependence, which from a TCE perspective involves switching costs and a hold-up risk (Williamson, 1985), and from an RBV perspective is a capability that the firm never internalised (Barney, 1991). The China-to-Italy case illustrates both sides of the coin: the firm lacked the capability to substitute the supplier (a resource gap) and at the same time faced a decline in the relational terms as volumes decreased (a governance problem) (Pedroletti, 2025). Combined, the two views also help to answer the central puzzle the thesis started with: why firms that have already made the decision to reshore still have difficulties in reshoring. The decision is a comparison of locations, but the implementation involves dismantling governance arrangements (TCE) and rebuilding scarce resources (RBV), neither of which is captured by the comparison of locations.</w:t>
+        <w:t>The two views are most effective when used together, as several barriers are both transaction-cost and capability issues. The most obvious example is host-supplier dependence. From a TCE perspective, it involves switching costs and a hold-up risk (Williamson, 1985). From an RBV perspective, it is a capability that the firm never internalised (Barney, 1991). The China-to-Italy case illustrates both sides of the coin: the firm lacked the capability to substitute the supplier (a resource gap) and at the same time faced a decline in the relational terms as volumes decreased (a governance problem) (Pedroletti, 2025). Combined, the two views also help to answer the central puzzle the thesis started with: why firms that have already made the decision to reshore still have difficulties in reshoring. The decision is a comparison of locations, but the implementation involves dismantling governance arrangements (TCE) and rebuilding scarce resources (RBV), neither of which is captured by the comparison of locations.</w:t>
       </w:r>
     </w:p>
     <w:p>
       <w:r>
-        <w:t>It should be recognized that this theoretical apparatus is limited. Two findings are somewhat out of place in it: the negative relational response of the Chinese supplier is more of a network and embeddedness phenomenon, as trust and mutual orientation are not firm-level costs or resources, but rather a relationship-level phenomenon (Pedroletti, 2025); and the education-system mismatch is an institutional condition, which neither TCE nor RBV directly addresses, as no individual firm can transact or resource its way out of a national skills shortage (Mirzaei et al., 2021). The application of TCE and RBV as the organising lenses thus provides analytical clarity at the cost of neglecting the relational and institutional aspects, which could be a focus for future theoretical research on reshoring implementation.</w:t>
+        <w:t>It should be recognized that this theoretical apparatus is limited. Two findings are somewhat out of place in it. The negative relational response of the Chinese supplier is more of a network and embeddedness phenomenon, as trust and mutual orientation are not firm-level costs or resources, but rather a relationship-level phenomenon (Pedroletti, 2025). The education-system mismatch is also an institutional condition, which neither TCE nor RBV directly addresses, as no individual firm can transact or resource its way out of a national skills shortage (Mirzaei et al., 2021). The application of TCE and RBV as the organising lenses thus provides analytical clarity at the cost of neglecting the relational and institutional aspects, which could be a focus for future theoretical research on reshoring implementation.</w:t>
       </w:r>
     </w:p>
     <w:p>
@@ -4225,17 +4225,17 @@
     </w:p>
     <w:p>
       <w:r>
-        <w:t>During the feasibility and preparation phase, the results show the worth of two tests that the analyzed cases imply are not complete most of the time. The former is a true total-cost analysis of the return: the data on cost miscalculation (Li et al., 2025) and underestimated operational adjustments (Boffelli et al., 2021) indicate that companies plan the visible part of the transaction — equipment, freight, facilities — while underestimating transition costs, ramp-up losses, and coordination burdens; the total-cost-of-acquisition logic of the reshoring literature (Ocicka, 2016) is applicable to leaving Asia as much as it is to going there. The second is a capability audit prior to commitment: managers are supposed to evaluate what production knowledge, skills, and supplier capabilities the firm actually has control over, and what is held by the host-country supplier or subsidiary, as the China-to-Italy case demonstrates that a capability that the firm thought it could substitute decided the whole range of what could be reshored (Pedroletti, 2025).</w:t>
+        <w:t>During the feasibility and preparation phase, the results show the worth of two tests that the analyzed cases imply are not complete most of the time. The former is a true total-cost analysis of the return. Data on cost miscalculation indicate that companies plan the visible part of the transaction — equipment, freight, facilities — while underestimating transition costs and ramp-up losses (Li et al., 2025). Underestimated operational adjustments point to the same pattern, with coordination burdens also overlooked (Boffelli et al., 2021). The total-cost-of-acquisition logic of the reshoring literature is applicable to leaving Asia as much as it is to going there (Ocicka, 2016). The second is a capability audit prior to commitment: managers are supposed to evaluate what production knowledge, skills, and supplier capabilities the firm actually has control over, and what is held by the host-country supplier or subsidiary, as the China-to-Italy case demonstrates that a capability that the firm thought it could substitute decided the whole range of what could be reshored (Pedroletti, 2025).</w:t>
       </w:r>
     </w:p>
     <w:p>
       <w:r>
-        <w:t>The results at the exit stage show the importance of legal and regulatory due diligence in the host country long before the decision is announced. The rate and cost of exit among the firms studied were influenced by layoff policies, closure policies, and contractual requirements (Li et al., 2025), and the literature review includes closure fees, fiscal requirements, and the social aspect of plant closure (Di Stefano &amp; Fratocchi, 2019). The exit costs and timelines should be considered as a separate budget line by a firm that is considering reshoring, and, where the evidence on employee and stakeholder reactions is taken seriously (Di Stefano &amp; Fratocchi, 2019), the communication and treatment of the offshore workforce should be planned as a part of the implementation, not as an afterthought.</w:t>
+        <w:t>The results at the exit stage show the importance of legal and regulatory due diligence in the host country long before the decision is announced. The rate and cost of exit among the firms studied were influenced by layoff policies, closure policies, and contractual requirements (Li et al., 2025). The literature review also includes closure fees, fiscal requirements, and the social aspect of plant closure (Di Stefano &amp; Fratocchi, 2019). The exit costs and timelines should be considered as a separate budget line by a firm that is considering reshoring, and, where the evidence on employee and stakeholder reactions is taken seriously (Di Stefano &amp; Fratocchi, 2019), the communication and treatment of the offshore workforce should be planned as a part of the implementation, not as an afterthought.</w:t>
       </w:r>
     </w:p>
     <w:p>
       <w:r>
-        <w:t>The most powerful single practical lesson of the review during transfer and rebuilding is that production capability is a system and not a purchase. The China-to-UK case indicates that machinery acquisition must be scheduled along with complementary tooling, software, technical services, and a workforce-training programme with a realistic time horizon — in that case about a year of learning before acceptable quality was achieved, a figure that reflects the experience of one case, not a standard, but that usefully scales expectations (Pegoraro et al., 2022). Since the domestic supplier base might have been diluted over the offshoring years (Ocicka, 2016; Mirzaei et al., 2021), supplier mapping and early involvement in the ecosystem of the home region, including training institutions, equipment suppliers, industrial-support organisations, are suggested, as regional preparedness was reflected in the case evidence in the form of search and development time added to the schedule (Pegoraro et al., 2022).</w:t>
+        <w:t>The most powerful single practical lesson of the review during transfer and rebuilding is that production capability is a system and not a purchase. The China-to-UK case indicates that machinery acquisition must be scheduled along with complementary tooling, software, technical services, and a workforce-training programme with a realistic time horizon — in that case about a year of learning before acceptable quality was achieved, a figure that reflects the experience of one case, not a standard, but that usefully scales expectations (Pegoraro et al., 2022). The domestic supplier base might have been diluted over the offshoring years (Ocicka, 2016; Mirzaei et al., 2021). Supplier mapping and early involvement in the ecosystem of the home region — including training institutions, equipment suppliers, and industrial-support organisations — are therefore suggested, since regional preparedness was reflected in the case evidence in the form of search and development time added to the schedule (Pegoraro et al., 2022).</w:t>
       </w:r>
     </w:p>
     <w:p>
@@ -4245,7 +4245,7 @@
     </w:p>
     <w:p>
       <w:r>
-        <w:t>Lastly, the organisational results suggest that the capacity of implementation itself should be given managerial consideration. The relationship between implementation errors and relocation failure (Boffelli et al., 2021), along with the evidence of internal silos and poor employee engagement in domestic manufacturing (Mirzaei et al., 2021), suggests the importance of cross-functional coordination — the introduction of production, sourcing, product development, and finance into the reshoring programme early — and the need to treat the return as an organisational change project, rather than a logistics exercise. In cases where automation is included in the business case, the dual-role evidence must be moderated: technology can compensate the cost disadvantages of home countries, but its implementation requires digital skills, investment, and organisational adaptation of its own (Bilbao-Ubillos et al., 2024; Gupta et al., 2023; D'Ambrosio &amp; Lavoratori, 2025), and an automation-dependent reshoring strategy must include an honest evaluation of the digital preparedness and size of the firm. Collectively, these deliberations respond to the second sub-question: the managerial path to reshoring barriers mitigation is through initial capability and dependency analysis, realistic total costing, host-country exit planning, systematic reestablishment of production capability, intentional supplier reconfiguration, and investment in the own implementation capacity of the organisation.</w:t>
+        <w:t>Lastly, the organisational results suggest that the capacity of implementation itself should be given managerial consideration. The relationship between implementation errors and relocation failure suggests the importance of cross-functional coordination — the introduction of production, sourcing, product development, and finance into the reshoring programme early — and the need to treat the return as an organisational change project, rather than a logistics exercise (Boffelli et al., 2021). The evidence of internal silos and poor employee engagement in domestic manufacturing points in the same direction (Mirzaei et al., 2021). In cases where automation is included in the business case, the dual-role evidence must be moderated: technology can compensate the cost disadvantages of home countries, but its implementation requires digital skills, investment, and organisational adaptation of its own (Bilbao-Ubillos et al., 2024; Gupta et al., 2023; D'Ambrosio &amp; Lavoratori, 2025), and an automation-dependent reshoring strategy must include an honest evaluation of the digital preparedness and size of the firm. Collectively, these deliberations respond to the second sub-question: the managerial path to reshoring barriers mitigation is through initial capability and dependency analysis, realistic total costing, host-country exit planning, systematic reestablishment of production capability, intentional supplier reconfiguration, and investment in the own implementation capacity of the organisation.</w:t>
       </w:r>
     </w:p>
     <w:p>
@@ -4292,7 +4292,7 @@
         <w:t>Core research question.</w:t>
       </w:r>
       <w:r>
-        <w:t xml:space="preserve"> The key obstacles that manufacturing companies encounter when implementing reshoring from Asian markets, on the evidence reviewed, are, first and foremost, the rebuilding of domestic capability: the skills, machinery, tooling, and the ecosystem of suppliers that have been lost over the years of offshoring and cannot be rebuilt through acquisition alone (Pegoraro et al., 2022). This is closely related to reliance on specialised host-country suppliers, as in the case evidence documented, this limited not only the manner in which a return was conducted but also the extent of the return that was possible (Pedroletti, 2025). These capability-side challenges are exacerbated by the underestimation of operational changes and organisational readiness gaps (Boffelli et al., 2021), the new fixed and coordination costs that a return brings, and, less obviously but still, by host-country exit constraints like layoff regulations and closure obligations (Li et al., 2025). All these barriers do not exist in a vacuum: a capability gap may lead to operational and relational challenges, and poor organisational preparedness magnifies any other barriers that a firm faces. Implementation thus becomes a separate and challenging phase, rather than a routine that can be taken for granted after the location decision is made.</w:t>
+        <w:t xml:space="preserve"> The key obstacles that manufacturing companies encounter when implementing reshoring from Asian markets, on the evidence reviewed, are, first and foremost, the rebuilding of domestic capability: the skills, machinery, tooling, and the ecosystem of suppliers that have been lost over the years of offshoring and cannot be rebuilt through acquisition alone (Pegoraro et al., 2022). This is closely related to reliance on specialised host-country suppliers, as in the case evidence documented, this limited not only the manner in which a return was conducted but also the extent of the return that was possible (Pedroletti, 2025). These capability-side challenges are exacerbated by the underestimation of operational changes and organisational readiness gaps, along with the new fixed and coordination costs that a return brings (Boffelli et al., 2021). Less obviously but no less durably, they are exacerbated further by host-country exit constraints such as layoff regulations and closure obligations (Li et al., 2025). All these barriers do not exist in a vacuum: a capability gap may lead to operational and relational challenges, and poor organisational preparedness magnifies any other barriers that a firm faces. Implementation thus becomes a separate and challenging phase, rather than a routine that can be taken for granted after the location decision is made.</w:t>
       </w:r>
     </w:p>
     <w:p>

</xml_diff>

<commit_message>
Expand chapter introductions to match benchmark thesis proportions
Chapter openings (between the chapter heading and the first subsection)
were 48-72 words each, against roughly 340-500 words in the benchmark
thesis. Expanded the intros of Chapters 2-5 to 150-215 words each. Each
new intro does substantive framing work - why the chapter's task matters
and how to read it - plus a brief section guide, using only claims and
citations already established and verified elsewhere in the thesis
(Tsai & Urmetzer 2024 and Wiesmann et al. 2017 in Ch. 2; Snyder 2019 in
Ch. 3; no citations needed in Ch. 4/5 intros). No new sources, no new
claims, no change to any section body text.

Co-Authored-By: Claude Fable 5 <noreply@anthropic.com>
Claude-Session: https://claude.ai/code/session_01HJq9GBe6o3FZumGTYdfLDW
</commit_message>
<xml_diff>
--- a/thesis/COMPILED_DRAFT_FULL.docx
+++ b/thesis/COMPILED_DRAFT_FULL.docx
@@ -176,7 +176,12 @@
     </w:p>
     <w:p>
       <w:r>
-        <w:t>This chapter lays the conceptual and theoretical groundwork for the study. It clarifies the concept of reshoring and differentiates it from other types of manufacturing relocation, presents the two theoretical lenses through which the results are interpreted, distinguishes between the drivers of reshoring and the barriers to reshoring, and outlines the research gap that the thesis addresses.</w:t>
+        <w:t>This chapter lays the conceptual and theoretical groundwork for the study. Reshoring has developed into an active research field over the past decade, but its growth has come with two complications that matter directly for this thesis. The first is terminological: the vocabulary of relocation — reshoring, backshoring, nearshoring, re-offshoring — has been applied inconsistently across studies, so a precise definition is a precondition for any meaningful synthesis (Tsai &amp; Urmetzer, 2024). The second is theoretical: the field has no single unifying theory, and individual studies interpret the phenomenon through different lenses (Wiesmann et al., 2017). A review that ignores either complication risks combining findings that are not actually about the same phenomenon, or reading them through an unstated theoretical frame.</w:t>
+      </w:r>
+    </w:p>
+    <w:p>
+      <w:r>
+        <w:t>Both complications shape the structure of this chapter. Section 2.1 clarifies the concept of reshoring and separates it from neighbouring forms of relocation that fall outside the scope of this thesis. Section 2.2 presents the two theoretical perspectives used to interpret the results, Transaction Cost Economics and the Resource-Based View. Section 2.3 draws the distinction between the drivers of reshoring and the implementation barriers that are the subject of this study, and Section 2.4 reviews the existing knowledge on reshoring barriers and identifies the research gap the thesis addresses.</w:t>
       </w:r>
     </w:p>
     <w:p>
@@ -296,7 +301,12 @@
     </w:p>
     <w:p>
       <w:r>
-        <w:t>This chapter outlines the design of the study: the rationale for conducting a systematic literature review, how the literature was searched and screened, and how the included studies were analysed and coded into the firm-level barrier framework. Methodological limitations are discussed together with the findings they qualify in Section 5.4.</w:t>
+        <w:t>This chapter outlines how the study was designed and carried out. Because the thesis asks a question about existing evidence — what barriers manufacturing firms face when implementing reshoring from Asian markets — rather than a question requiring new company data, the value of the answer depends on how the existing studies were found, selected, and analysed. The credibility of a literature-based synthesis rests on making that process transparent enough for the reader to judge it (Snyder, 2019).</w:t>
+      </w:r>
+    </w:p>
+    <w:p>
+      <w:r>
+        <w:t>The chapter therefore documents the three steps on which the synthesis is built. Section 3.1 explains why a systematic literature review is the appropriate design for the research questions. Section 3.2 describes the literature search and the criteria used to select the analytical sample, summarised in the flow diagram in Figure 1. Section 3.3 explains how the findings of the included studies were coded into barrier themes and how those themes were organised within the four categories of the firm-level framework, illustrated in Table 1. Methodological limitations are discussed together with the findings they qualify in Section 5.4.</w:t>
       </w:r>
     </w:p>
     <w:p>
@@ -759,7 +769,12 @@
     </w:p>
     <w:p>
       <w:r>
-        <w:t>This chapter presents the reshoring implementation barriers from the reviewed literature, first the evidence base on which the synthesis is based, followed by the evidence synthesized category-wise, and finally, the evidence that appears to have the broadest acceptance in the reviewed literature, namely the asset/capability barriers.</w:t>
+        <w:t>This chapter reports what the reviewed literature shows about the barriers manufacturing firms face when implementing reshoring from Asian markets. Two reading rules apply throughout the chapter. First, the three types of evidence — direct empirical findings, review-reported findings, and conceptual arguments — are kept apart, because a case observation, a review finding, and a conceptual argument do not support a claim in the same way. Second, findings are attributed to an Asian host country only where a study explicitly makes that link; evidence that is general in scope is reported as general.</w:t>
+      </w:r>
+    </w:p>
+    <w:p>
+      <w:r>
+        <w:t>The chapter proceeds from the evidence base to the barriers themselves. Section 4.1 describes the analytical sample and presents the overview of all eighteen barrier themes in Table 2. Sections 4.2 to 4.5 then report the barriers by framework category, ending with the asset/capability category, which has the broadest support in the reviewed literature.</w:t>
       </w:r>
     </w:p>
     <w:p>
@@ -2835,7 +2850,12 @@
     </w:p>
     <w:p>
       <w:r>
-        <w:t>This chapter is an interpretation of the eighteen barrier themes reported in Chapter 4, what they mean for firms returning production from Asian host countries, how they reinforce one another, and what follows from them theoretically and managerially. Interpretations made by this thesis are differentiated from findings reported by the original studies throughout, and evidence of direct implementation is given more analytical weight than evidence at the review level or conceptual level.</w:t>
+        <w:t>This chapter interprets the eighteen barrier themes reported in Chapter 4. Reporting what the literature contains is only the first half of a synthesis; the second half is explaining what the findings mean for firms returning production from Asian host countries, how the barriers reinforce one another, and what follows from them in theoretical and managerial terms.</w:t>
+      </w:r>
+    </w:p>
+    <w:p>
+      <w:r>
+        <w:t>Section 5.1 discusses the overall pattern of the results and the interactions between the barrier categories. Section 5.2 interprets the findings through Transaction Cost Economics and the Resource-Based View, and Section 5.3 derives the managerial implications that answer the second sub-question of the thesis. Section 5.4 sets out the limitations of the study and the research directions that follow from them. Throughout the chapter, interpretations made by this thesis are distinguished from findings reported by the original studies, and direct implementation evidence is given more analytical weight than review-level or conceptual evidence.</w:t>
       </w:r>
     </w:p>
     <w:p>

</xml_diff>

<commit_message>
Move every remaining mid-sentence citation to end-of-sentence position
Automated per-citation scan found 23 sentences (10 in Ch. 4, 5 in Ch. 2,
8 in Ch. 5) where a citation still sat mid-sentence with substantive text
following it - mostly sentences with a trailing clause after the
citation ("(X, 2019), suggesting that...", "(X, 2025) and is recorded
here...", "In the China-to-Italy case (X, 2025), ...") and inventory
sentences identifying sources parenthetically mid-list. Each was either
split into separate sentences or restructured so the citation falls at
the sentence end, per the author's standing all-citations-at-the-end
rule. No claim, attribution, or hedge changed. Scan now reports zero
mid-sentence citations across all six chapters; 35 references, all
cited, no orphans.

Co-Authored-By: Claude Fable 5 <noreply@anthropic.com>
Claude-Session: https://claude.ai/code/session_01HJq9GBe6o3FZumGTYdfLDW
</commit_message>
<xml_diff>
--- a/thesis/COMPILED_DRAFT_FULL.docx
+++ b/thesis/COMPILED_DRAFT_FULL.docx
@@ -227,12 +227,12 @@
     </w:p>
     <w:p>
       <w:r>
-        <w:t>In this plural background, the two theories used in this thesis are Transaction Cost Economics (TCE) and the Resource-Based View (RBV), as originally formulated (Williamson, 1985; Barney, 1991); if a reviewed study uses a different theory, this is indicated. Transaction Cost Economics directs attention to the costs of organising economic activity across firm and country boundaries, emphasising asset specificity, contractual safeguards, and the governance of exchange relationships (Williamson, 1985). This theory was not developed with reshoring in mind, and applying its concepts to the return of production is this thesis's own interpretation. From a TCE perspective, the exit side of implementation becomes visible: offshore arrangements embody committed investments and contractual obligations, and unwinding them carries real costs. Empirical evidence is consistent with this logic. Strict host-country layoff regulations and locked investments make it difficult to exit the host country quickly (Li et al., 2025). Plant-closure fees and fiscal obligations are also reported in the review literature (Di Stefano &amp; Fratocchi, 2019). A further cost arises from the coordination burden that appears when production is split between home and host locations during a partial return (Pedroletti, 2025). Transaction-cost reasoning also points to hidden costs. Sourcing decisions based on unit price are argued to systematically underestimate the total cost of offshore acquisition (Ocicka, 2016). Firms are also reported to underestimate the operational adjustments that relocation requires (Boffelli et al., 2021).</w:t>
+        <w:t>In this plural background, the two theories used in this thesis are Transaction Cost Economics (TCE) and the Resource-Based View (RBV), as originally formulated (Williamson, 1985; Barney, 1991). If a reviewed study uses a different theory, this is indicated. Transaction Cost Economics directs attention to the costs of organising economic activity across firm and country boundaries, emphasising asset specificity, contractual safeguards, and the governance of exchange relationships (Williamson, 1985). This theory was not developed with reshoring in mind, and applying its concepts to the return of production is this thesis's own interpretation. From a TCE perspective, the exit side of implementation becomes visible: offshore arrangements embody committed investments and contractual obligations, and unwinding them carries real costs. Empirical evidence is consistent with this logic. Strict host-country layoff regulations and locked investments make it difficult to exit the host country quickly (Li et al., 2025). Plant-closure fees and fiscal obligations are also reported in the review literature (Di Stefano &amp; Fratocchi, 2019). A further cost arises from the coordination burden that appears when production is split between home and host locations during a partial return (Pedroletti, 2025). Transaction-cost reasoning also points to hidden costs. Sourcing decisions based on unit price are argued to systematically underestimate the total cost of offshore acquisition (Ocicka, 2016). Firms are also reported to underestimate the operational adjustments that relocation requires (Boffelli et al., 2021).</w:t>
       </w:r>
     </w:p>
     <w:p>
       <w:r>
-        <w:t>The Resource-Based View — the theory that competitive advantage rests on resources that are valuable, rare, imperfectly imitable and non-substitutable (Barney, 1991) — provides insights on the arrival side of implementation; as with TCE, this application to reshoring is the author's own interpretation. The RBV perspective suggests that the firm is a bundle of resources and capabilities, and reshoring will only be successful if the firm can rebuild or reacquire the productive resources (skills, machinery, routines, supplier relationships) needed by the home operation. The reshoring literature repeatedly mentions exactly such capability constraints. The loss of domestic manufacturing competences and capacity after long periods of offshoring is one recurring theme (Wiesmann et al., 2017). Reshoring firms also face a lack of specialised manpower (Di Mauro et al., 2018). Case evidence further documents the need to rebuild machinery, tooling, and workforce skills (Pegoraro et al., 2022). Conceptual work complements this reading: reshoring is argued to present new fixed costs and capability requirements for firms, with existing value chains remaining "sticky" due to prior investment (D'Ambrosio &amp; Lavoratori, 2025). Combined, the two lenses are complementary: TCE helps to understand why it is expensive to leave the host country and the RBV helps to understand why it is difficult to re-establish production at home.</w:t>
+        <w:t>The Resource-Based View provides insights on the arrival side of implementation. In this theory, competitive advantage rests on resources that are valuable, rare, imperfectly imitable and non-substitutable (Barney, 1991). As with TCE, the application to reshoring is the author's own interpretation. The RBV perspective suggests that the firm is a bundle of resources and capabilities, and reshoring will only be successful if the firm can rebuild or reacquire the productive resources (skills, machinery, routines, supplier relationships) needed by the home operation. The reshoring literature repeatedly mentions exactly such capability constraints. The loss of domestic manufacturing competences and capacity after long periods of offshoring is one recurring theme (Wiesmann et al., 2017). Reshoring firms also face a lack of specialised manpower (Di Mauro et al., 2018). Case evidence further documents the need to rebuild machinery, tooling, and workforce skills (Pegoraro et al., 2022). Conceptual work complements this reading: reshoring is argued to present new fixed costs and capability requirements for firms, with existing value chains remaining "sticky" due to prior investment (D'Ambrosio &amp; Lavoratori, 2025). Combined, the two lenses are complementary: TCE helps to understand why it is expensive to leave the host country and the RBV helps to understand why it is difficult to re-establish production at home.</w:t>
       </w:r>
     </w:p>
     <w:p>
@@ -245,7 +245,7 @@
     </w:p>
     <w:p>
       <w:r>
-        <w:t>This thesis makes a distinction between the motivations for reshoring and the challenges of reshoring. The literature on drivers is relatively well developed (Wiesmann et al., 2017). Offshoring is concluded to be primarily motivated by cost reduction, while backshoring typically occurs as a result of a strategic reorientation towards customer perceived value, and the return is not necessarily a managerial error, but rather a strategic evolution (Di Mauro et al., 2018). Quantitative firm-level evidence links reshoring decisions to home-country conditions (Wan et al., 2019). Other quantitative evidence links reshoring decisions to Industry 4.0 adoption, pandemic experience, and made-in effects (Stentoft et al., 2025). Survey and case research has also explored the link between digital-technology adoption and backshoring decisions (Kamp &amp; Gibaja, 2021). A quantitative survey of Finnish manufacturers similarly links firm characteristics and technology intensity to the decision to backshore (Heikkilä et al., 2018), and expert-based decision analysis has examined the criteria apparel firms weigh when considering reshoring (Pourhejazy &amp; Ashby, 2021).</w:t>
+        <w:t>This thesis makes a distinction between the motivations for reshoring and the challenges of reshoring. The literature on drivers is relatively well developed (Wiesmann et al., 2017). Offshoring is concluded to be primarily motivated by cost reduction, while backshoring typically occurs as a result of a strategic reorientation towards customer perceived value, and the return is not necessarily a managerial error, but rather a strategic evolution (Di Mauro et al., 2018). Quantitative firm-level evidence links reshoring decisions to home-country conditions (Wan et al., 2019). Other quantitative evidence links reshoring decisions to Industry 4.0 adoption, pandemic experience, and made-in effects (Stentoft et al., 2025). Survey and case research has also explored the link between digital-technology adoption and backshoring decisions (Kamp &amp; Gibaja, 2021). A quantitative survey of Finnish manufacturers similarly links firm characteristics and technology intensity to the decision to backshore (Heikkilä et al., 2018). Expert-based decision analysis has also examined the criteria apparel firms weigh when considering reshoring (Pourhejazy &amp; Ashby, 2021).</w:t>
       </w:r>
     </w:p>
     <w:p>
@@ -273,12 +273,12 @@
     </w:p>
     <w:p>
       <w:r>
-        <w:t>Subsequent review studies have taken the barrier debate in certain directions. The link between backshoring and sustainability has been discussed, showing that environmental and social considerations can be drivers, outcomes, or barriers, such as regulatory and social barriers to exit the host country (Di Stefano &amp; Fratocchi, 2019). Technology-readiness themes are derived from reviews that highlight how technology can make reshoring more attractive by decreasing the relevance of labour costs and increasing the relevance of proximity, but also that new technical skills, organisational adaptation and investment are required for its deployment (Espíndola et al., 2023; Bilbao-Ubillos et al., 2024). Similarly, Industry 4.0 is said to have a dual effect, enabling reshoring while creating new capability requirements (Gupta et al., 2023). Conceptually, some of these strands are combined in an argument that the stickiness of existing value chains, the new fixed costs of domestic production, and firm-size differences — larger firms may prefer nearshoring or friendshoring, while smaller, constrained firms may reshore defensively "to survive" — explain the rarity of reshoring (D'Ambrosio &amp; Lavoratori, 2025). Empirical studies on high-cost home environments reveal that firms producing in their home countries are under labour-cost pressure, suffer from a shortage of skills, and experience gaps in their supplier networks and internal organisational friction (Mirzaei et al., 2021), which any repatriating firm will inherit.</w:t>
+        <w:t>Subsequent review studies have taken the barrier debate in certain directions. The link between backshoring and sustainability has been discussed, showing that environmental and social considerations can be drivers, outcomes, or barriers, such as regulatory and social barriers to exit the host country (Di Stefano &amp; Fratocchi, 2019). Technology-readiness themes are derived from reviews that highlight how technology can make reshoring more attractive by decreasing the relevance of labour costs and increasing the relevance of proximity, but also that new technical skills, organisational adaptation and investment are required for its deployment (Espíndola et al., 2023; Bilbao-Ubillos et al., 2024). Similarly, Industry 4.0 is said to have a dual effect, enabling reshoring while creating new capability requirements (Gupta et al., 2023). Conceptually, some of these strands are combined in an argument that the stickiness of existing value chains, the new fixed costs of domestic production, and firm-size differences — larger firms may prefer nearshoring or friendshoring, while smaller, constrained firms may reshore defensively "to survive" — explain the rarity of reshoring (D'Ambrosio &amp; Lavoratori, 2025). Empirical studies on high-cost home environments reveal that firms producing in their home countries are under labour-cost pressure, suffer from a shortage of skills, and experience gaps in their supplier networks and internal organisational friction — conditions that any repatriating firm will inherit (Mirzaei et al., 2021).</w:t>
       </w:r>
     </w:p>
     <w:p>
       <w:r>
-        <w:t>The research gap is identified by three limitations of this body of knowledge. The most basic is fragmentation: individual studies identify individual obstacles, but consolidated, firm-level syntheses focused specifically on implementation are rare, and the implementation stage remains under-researched compared with the reshoring decision (Ocicka, 2016; Pedroletti &amp; Ciabuschi, 2023). The evidence is also diverse in nature, with direct observations of cases, review-level aggregations, and conceptual arguments all being cited as evidence, but each of these types of evidence is different and thus must be interpreted differently. Most important for this thesis, the literature is not disaggregated in an Asia-specific manner. Although Asia is the primary offshore manufacturing destination (Gao et al., 2022), most studies report barriers at the sample level, and do not differentiate between barriers that relate to the return from Asian host countries. There are a few cases of direct implementation evidence. One is a China-to-UK case that documents skills, machinery and ramp-up difficulties (Pegoraro et al., 2022). Another is a China-to-Italy case that documents supplier dependence and coordination burdens in a partial return (Pedroletti, 2025). The four categories in this thesis — regulatory/institutional, cultural/organisational, cost/operational, and asset/capability barriers — are designed to bring together this fragmented evidence at the firm level while maintaining the distinction between empirical, review, conceptual, and Asia-specific evidence.</w:t>
+        <w:t>The research gap is identified by three limitations of this body of knowledge. The most basic is fragmentation: individual studies identify individual obstacles, but consolidated, firm-level syntheses focused specifically on implementation are rare, and the implementation stage remains under-researched compared with the reshoring decision (Ocicka, 2016; Pedroletti &amp; Ciabuschi, 2023). The evidence is also diverse in nature, with direct observations of cases, review-level aggregations, and conceptual arguments all being cited as evidence, but each of these types of evidence is different and thus must be interpreted differently. Most important for this thesis, the literature is not disaggregated in an Asia-specific manner. Asia is the primary offshore manufacturing destination (Gao et al., 2022). Even so, most studies report barriers at the sample level and do not differentiate between barriers that relate to the return from Asian host countries. There are a few cases of direct implementation evidence. One is a China-to-UK case that documents skills, machinery and ramp-up difficulties (Pegoraro et al., 2022). Another is a China-to-Italy case that documents supplier dependence and coordination burdens in a partial return (Pedroletti, 2025). The four categories in this thesis — regulatory/institutional, cultural/organisational, cost/operational, and asset/capability barriers — are designed to bring together this fragmented evidence at the firm level while maintaining the distinction between empirical, review, conceptual, and Asia-specific evidence.</w:t>
       </w:r>
     </w:p>
     <w:p>
@@ -759,7 +759,7 @@
     </w:p>
     <w:p>
       <w:r>
-        <w:t>The reviewed literature does not speak about reshoring barriers with one voice: some studies observe individual returns directly (Pegoraro et al., 2022; Pedroletti, 2025), others draw on multiple firms or cases (Boffelli et al., 2021; Li et al., 2025; Mirzaei et al., 2021), and others aggregate previous findings in reviews or argue conceptually (Wiesmann et al., 2017; D'Ambrosio &amp; Lavoratori, 2025). Two reading rules therefore apply to everything reported below. First, the three types of evidence — direct empirical findings, review-reported findings, and conceptual arguments — are kept apart, because a case observation, a review finding, and a conceptual argument do not support a claim in the same way. Second, findings are attributed to an Asian host country only where a study explicitly makes that link; evidence that is general in scope is reported as general. The overview of the evidence base and of all eighteen barrier themes (Table 2) comes first, followed by the barriers in each of the four framework categories, ending with the asset/capability barriers, which have the broadest support in the reviewed literature.</w:t>
+        <w:t>The reviewed literature does not speak about reshoring barriers with one voice. Some studies observe individual returns directly (Pegoraro et al., 2022; Pedroletti, 2025). Others draw on multiple firms or cases (Boffelli et al., 2021; Li et al., 2025; Mirzaei et al., 2021). Others again aggregate previous findings in reviews or argue conceptually (Wiesmann et al., 2017; D'Ambrosio &amp; Lavoratori, 2025). Two reading rules therefore apply to everything reported below. First, the three types of evidence — direct empirical findings, review-reported findings, and conceptual arguments — are kept apart, because a case observation, a review finding, and a conceptual argument do not support a claim in the same way. Second, findings are attributed to an Asian host country only where a study explicitly makes that link; evidence that is general in scope is reported as general. The overview of the evidence base and of all eighteen barrier themes (Table 2) comes first, followed by the barriers in each of the four framework categories, ending with the asset/capability barriers, which have the broadest support in the reviewed literature.</w:t>
       </w:r>
     </w:p>
     <w:p>
@@ -772,12 +772,12 @@
     </w:p>
     <w:p>
       <w:r>
-        <w:t>The barrier synthesis is based on the formal analytical sample of 21 sources described in the methodology. Fourteen of these sources provide direct barrier evidence and are coded in Table 1 and Table 2; a fifteenth source (Robinson &amp; Hsieh, 2016) is represented only as contextual evidence on drivers and strategic renewal, not as a barrier-theme entry, and a sixteenth (Tsai &amp; Urmetzer, 2024) is used solely as a basis for terminology and frameworks, not for barrier evidence. The synthesis categorizes the identified barriers into 18 themes that are grouped in the four categories of the firm-level framework, answering the first sub-question of the thesis.</w:t>
+        <w:t>The barrier synthesis is based on the formal analytical sample of 21 sources described in the methodology. Fourteen of these sources provide direct barrier evidence and are coded in Table 1 and Table 2. A fifteenth source is represented only as contextual evidence on drivers and strategic renewal, not as a barrier-theme entry (Robinson &amp; Hsieh, 2016). A sixteenth is used solely as a basis for terminology and frameworks, not for barrier evidence (Tsai &amp; Urmetzer, 2024). The synthesis categorizes the identified barriers into 18 themes that are grouped in the four categories of the firm-level framework, answering the first sub-question of the thesis.</w:t>
       </w:r>
     </w:p>
     <w:p>
       <w:r>
-        <w:t>There are 3 types of contributing evidence. There are four main empirical studies (Boffelli et al., 2021; Li et al., 2025; Pegoraro et al., 2022; Pedroletti, 2025) and two auxiliary empirical studies (Di Mauro et al., 2018; Mirzaei et al., 2021). A third supporting empirical study (Robinson &amp; Hsieh, 2016) provides only contextual evidence. The evidence from literature is derived from six sources (Pedroletti &amp; Ciabuschi, 2023; Wiesmann et al., 2017; Espíndola et al., 2023; Di Stefano &amp; Fratocchi, 2019; Ocicka, 2016; Bilbao-Ubillos et al., 2024), while conceptual argument comes from two further sources (D'Ambrosio &amp; Lavoratori, 2025; Gupta et al., 2023). The types are listed separately in each section, to avoid consolidating them into a single frequency since the evidential weight of a case observation is different from that of a review finding, or a conceptual argument. Both the two main empirical studies (Pegoraro et al., 2022; Pedroletti, 2025) have a single case design and the results are presented as case studies, not generalisations.</w:t>
+        <w:t>There are 3 types of contributing evidence. There are four main empirical studies (Boffelli et al., 2021; Li et al., 2025; Pegoraro et al., 2022; Pedroletti, 2025). Two further studies provide auxiliary empirical evidence (Di Mauro et al., 2018; Mirzaei et al., 2021). A third supporting empirical study provides only contextual evidence (Robinson &amp; Hsieh, 2016). The evidence from literature is derived from six sources (Pedroletti &amp; Ciabuschi, 2023; Wiesmann et al., 2017; Espíndola et al., 2023; Di Stefano &amp; Fratocchi, 2019; Ocicka, 2016; Bilbao-Ubillos et al., 2024). Conceptual argument comes from two further sources (D'Ambrosio &amp; Lavoratori, 2025; Gupta et al., 2023). The types are listed separately throughout, to avoid consolidating them into a single frequency, since the evidential weight of a case observation is different from that of a review finding, or a conceptual argument. Both of the two main empirical studies have a single-case design, and their results are presented as case studies, not generalisations (Pegoraro et al., 2022; Pedroletti, 2025).</w:t>
       </w:r>
     </w:p>
     <w:p>
@@ -2713,7 +2713,7 @@
     </w:p>
     <w:p>
       <w:r>
-        <w:t>The review literature introduces a social aspect of exit which is in addition to, and not in place of, formal regulation. Social-responsibility concerns, such as managerial hesitation to close a plant or to fire the employees working there, can narrow down the foreign-plant closure decision and implementation process (Di Stefano &amp; Fratocchi, 2019); potential employee resistance during the closure of foreign production facilities is less well documented, and depends on the specific situation (Di Stefano &amp; Fratocchi, 2019). No empirical studies in the sample make an explicit observation of these constraints; they are based on review evidence only.</w:t>
+        <w:t>The review literature introduces a social aspect of exit which is in addition to, and not in place of, formal regulation. Social-responsibility concerns, such as managerial hesitation to close a plant or to fire the employees working there, can narrow down the foreign-plant closure decision and implementation process (Di Stefano &amp; Fratocchi, 2019). Potential employee resistance during the closure of foreign production facilities is less well documented and depends on the specific situation (Di Stefano &amp; Fratocchi, 2019). No empirical studies in the sample make an explicit observation of these constraints; they are based on review evidence only.</w:t>
       </w:r>
     </w:p>
     <w:p>
@@ -2746,7 +2746,7 @@
     </w:p>
     <w:p>
       <w:r>
-        <w:t>The governance mode of the return, i.e. whether reshored production is rebuilt in-house or outsourced to a domestic supplier, is identified as an under-researched dimension of reshoring rather than a documented barrier (Pedroletti &amp; Ciabuschi, 2023) and is recorded here as a gap in the evidence.</w:t>
+        <w:t>The governance mode of the return, i.e. whether reshored production is rebuilt in-house or outsourced to a domestic supplier, is identified as an under-researched dimension of reshoring rather than a documented barrier (Pedroletti &amp; Ciabuschi, 2023). It is recorded here as a gap in the evidence.</w:t>
       </w:r>
     </w:p>
     <w:p>
@@ -2779,7 +2779,7 @@
     </w:p>
     <w:p>
       <w:r>
-        <w:t>Where only part of production returns, hybrid operation creates its own operational burden. In the China-to-Italy case (Pedroletti, 2025), partial reshoring involved splitting production between Italian and Chinese suppliers, which required technically compatible components and more active cross-country coordination, at an additional cost, but also reduced the supplier base, leaving the firm with fewer, non-substitutable partners, less bargaining power, and higher switching costs. This is also a single case finding.</w:t>
+        <w:t>Where only part of production returns, hybrid operation creates its own operational burden. In the China-to-Italy case, partial reshoring involved splitting production between Italian and Chinese suppliers, which required technically compatible components and more active cross-country coordination, at an additional cost, but also reduced the supplier base, leaving the firm with fewer, non-substitutable partners, less bargaining power, and higher switching costs (Pedroletti, 2025). This is also a single case finding.</w:t>
       </w:r>
     </w:p>
     <w:p>
@@ -2807,7 +2807,7 @@
     </w:p>
     <w:p>
       <w:r>
-        <w:t>Capability constraints are not just within the firm's boundaries: specialised capabilities that are located with the host-country supplier may be hard to repatriate. In the China-to-Italy case (Pedroletti, 2025), the inability to fully replace the Chinese network was the reason for partial reshoring, as the firm lacked the production knowledge, experience with the components, specialised sourcing skills, and suitable domestic suppliers. The gap was not in the general ability to manufacture domestically, but in this particular and specialised ability. Swedish firms were also found to be dependent on suppliers and intellectual property, meaning that the firm does not have full control over the rights to a component or technology and cannot simply shift production home (Li et al., 2025). At review level, host-supplier dependence is reported (Wiesmann et al., 2017). Offshore knowledge dependence is reported similarly (Bilbao-Ubillos et al., 2024). Knowledge-transfer ambiguity — knowledge residing with offshore employees, subsidiaries, suppliers, or the host-country network — is identified at the conceptual level (Gupta et al., 2023).</w:t>
+        <w:t>Capability constraints are not just within the firm's boundaries: specialised capabilities that are located with the host-country supplier may be hard to repatriate. In the China-to-Italy case, the inability to fully replace the Chinese network was the reason for partial reshoring, as the firm lacked the production knowledge, experience with the components, specialised sourcing skills, and suitable domestic suppliers (Pedroletti, 2025). The gap was not in the general ability to manufacture domestically, but in this particular and specialised ability. Swedish firms were also found to be dependent on suppliers and intellectual property, meaning that the firm does not have full control over the rights to a component or technology and cannot simply shift production home (Li et al., 2025). At review level, host-supplier dependence is reported (Wiesmann et al., 2017). Offshore knowledge dependence is reported similarly (Bilbao-Ubillos et al., 2024). Knowledge-transfer ambiguity — knowledge residing with offshore employees, subsidiaries, suppliers, or the host-country network — is identified at the conceptual level (Gupta et al., 2023).</w:t>
       </w:r>
     </w:p>
     <w:p>
@@ -2835,7 +2835,7 @@
     </w:p>
     <w:p>
       <w:r>
-        <w:t>Reporting what the literature contains is only the first half of a synthesis; the second half is explaining what the findings mean for firms returning production from Asian host countries, how the barriers reinforce one another, and what follows from them in theoretical and managerial terms. The interpretation below moves from the overall pattern of the results and the interactions between the barrier categories, through a reading of the findings in the light of Transaction Cost Economics and the Resource-Based View, to the managerial implications that answer the second sub-question, and finally to the limitations of the study and the research directions that follow from them. Throughout, interpretations made by this thesis are distinguished from findings reported by the original studies, and direct implementation evidence — which in its truly Asia-specific core rests on two single cases (Pegoraro et al., 2022; Pedroletti, 2025) — is given more analytical weight than review-level or conceptual evidence.</w:t>
+        <w:t>Reporting what the literature contains is only the first half of a synthesis; the second half is explaining what the findings mean for firms returning production from Asian host countries, how the barriers reinforce one another, and what follows from them in theoretical and managerial terms. The interpretation below moves from the overall pattern of the results and the interactions between the barrier categories, through a reading of the findings in the light of Transaction Cost Economics and the Resource-Based View, to the managerial implications that answer the second sub-question, and finally to the limitations of the study and the research directions that follow from them. Throughout, interpretations made by this thesis are distinguished from findings reported by the original studies, and direct implementation evidence is given more analytical weight than review-level or conceptual evidence. In its truly Asia-specific core, that direct evidence rests on two single cases (Pegoraro et al., 2022; Pedroletti, 2025).</w:t>
       </w:r>
     </w:p>
     <w:p>
@@ -2848,7 +2848,7 @@
     </w:p>
     <w:p>
       <w:r>
-        <w:t>The most striking pattern in the results is the predominance of the asset/capability category. The only barrier theme that is supported by direct case evidence, review syntheses and conceptual argument is the domestic skills and competence gap, and the physical counterpart — missing capacity, machinery and complementary tooling — is almost as broadly supported. The evidence thus suggests that the main challenge of reshoring is not so much about making the right decision, or even about paying for the reshoring, but about rebuilding productive capacity that has been lost over the years of offshoring. The most compelling evidence for this interpretation is the China-to-UK case, where the acquisition of the machinery was only the first step: the company had to acquire tooling, software, technical services, and train its workforce for about a year before production quality was acceptable (Pegoraro et al., 2022). In this case (Pegoraro et al., 2022), a single acquisition decision was followed by a twelve-month capability-building process, providing a more tangible example than any overall finding of the need for a separate analysis of the implementation stage. The general empirical evidence is in the same direction. Even after the reshoring decision, Swedish companies faced challenges related to lack of skills, equipment, and capacity (Li et al., 2025; Mirzaei et al., 2021). Reshoring companies in labour-intensive sectors also experienced a shortage of skilled workforce (Di Mauro et al., 2018). The same cluster is found in review-level syntheses in the broader literature (Wiesmann et al., 2017; Ocicka, 2016). These results, however, are presented at the level of the Swedish sample and not disaggregated by host country (Li et al., 2025); they support the general pattern, not a China-specific claim.</w:t>
+        <w:t>The most striking pattern in the results is the predominance of the asset/capability category. The only barrier theme that is supported by direct case evidence, review syntheses and conceptual argument is the domestic skills and competence gap, and the physical counterpart — missing capacity, machinery and complementary tooling — is almost as broadly supported. The evidence thus suggests that the main challenge of reshoring is not so much about making the right decision, or even about paying for the reshoring, but about rebuilding productive capacity that has been lost over the years of offshoring. The most compelling evidence for this interpretation is the China-to-UK case, where the acquisition of the machinery was only the first step: the company had to acquire tooling, software, technical services, and train its workforce for about a year before production quality was acceptable (Pegoraro et al., 2022). In this case, a single acquisition decision was followed by a twelve-month capability-building process, providing a more tangible example than any overall finding of the need for a separate analysis of the implementation stage (Pegoraro et al., 2022). The general empirical evidence is in the same direction. Even after the reshoring decision, Swedish companies faced challenges related to lack of skills, equipment, and capacity (Li et al., 2025; Mirzaei et al., 2021). Reshoring companies in labour-intensive sectors also experienced a shortage of skilled workforce (Di Mauro et al., 2018). The same cluster is found in review-level syntheses in the broader literature (Wiesmann et al., 2017; Ocicka, 2016). These results, however, are presented at the level of the Swedish sample and not disaggregated by host country (Li et al., 2025). They support the general pattern, not a China-specific claim.</w:t>
       </w:r>
     </w:p>
     <w:p>
@@ -2868,7 +2868,7 @@
     </w:p>
     <w:p>
       <w:r>
-        <w:t>There are two qualifications to all these interpretations. The direct evidence that is truly Asia-specific is limited to two documented cases. One is an automotive supplier that returned from China to the United Kingdom (Pegoraro et al., 2022). The other is a manufacturer that partially returned from China to Italy (Pedroletti, 2025). As in the general pattern, these cases focus on capability rebuilding and supplier dependence, but two cases in one host country cannot be interpreted as representing Asian markets in general, and nothing here should be interpreted as a statement about, say, returns from Vietnam, India, or Indonesia. The second qualification relates to the thinness of the regulatory/institutional category, which is the least supported by direct empirical evidence. It could be because it is truly unimportant, but it could also be because of the makeup of the evidence base. The one study that systematically searched for them found exit-side regulatory constraints (Li et al., 2025). They are also mentioned in the review literature (Di Stefano &amp; Fratocchi, 2019), suggesting that they are not absent but under-observed. The categories are weighted here according to the evidence they have, but it is recognized that absence of evidence is not evidence of absence.</w:t>
+        <w:t>There are two qualifications to all these interpretations. The direct evidence that is truly Asia-specific is limited to two documented cases. One is an automotive supplier that returned from China to the United Kingdom (Pegoraro et al., 2022). The other is a manufacturer that partially returned from China to Italy (Pedroletti, 2025). As in the general pattern, these cases focus on capability rebuilding and supplier dependence, but two cases in one host country cannot be interpreted as representing Asian markets in general, and nothing here should be interpreted as a statement about, say, returns from Vietnam, India, or Indonesia. The second qualification relates to the thinness of the regulatory/institutional category, which is the least supported by direct empirical evidence. It could be because it is truly unimportant, but it could also be because of the makeup of the evidence base. The one study that systematically searched for them found exit-side regulatory constraints (Li et al., 2025). They are also mentioned in the review literature (Di Stefano &amp; Fratocchi, 2019). This suggests that they are not absent but under-observed. The categories are weighted here according to the evidence they have, but it is recognized that absence of evidence is not evidence of absence.</w:t>
       </w:r>
     </w:p>
     <w:p>
@@ -2891,7 +2891,7 @@
     </w:p>
     <w:p>
       <w:r>
-        <w:t>The findings from the arrival side are similarly coherent from a Resource-Based View perspective (Barney, 1991). The capabilities that offshoring firms allowed to erode — manufacturing skills, tacit production knowledge, supplier relationships, and functioning regional ecosystems — are the kinds of resources that the theory says are hard to imitate or acquire quickly: they are developed through experience, they are embedded in people and routines, and they rely on complementary assets (Barney, 1991). This is why the most consistent finding of the review is that capability gaps cannot be filled with a purchase. The China-to-UK case illustrates this in miniature: the machine could be purchased, but it took a year of training and error-elimination to be able to operate it productively (Pegoraro et al., 2022). The general evidence on skills shortages, generational knowledge loss, and supplier-network gaps shows the same logic at sample level (Di Mauro et al., 2018; Mirzaei et al., 2021; Ocicka, 2016). The availability of skilled labour, specialised suppliers, and supporting institutions in the home region (Pegoraro et al., 2022) acts as a complementary resource endowment that individual firms can access but not produce on their own, which also sheds light on the regional ecosystem findings.</w:t>
+        <w:t>The findings from the arrival side are similarly coherent from a Resource-Based View perspective (Barney, 1991). The capabilities that offshoring firms allowed to erode — manufacturing skills, tacit production knowledge, supplier relationships, and functioning regional ecosystems — are the kinds of resources that the theory says are hard to imitate or acquire quickly: they are developed through experience, they are embedded in people and routines, and they rely on complementary assets (Barney, 1991). This is why the most consistent finding of the review is that capability gaps cannot be filled with a purchase. The China-to-UK case illustrates this in miniature: the machine could be purchased, but it took a year of training and error-elimination to be able to operate it productively (Pegoraro et al., 2022). The general evidence on skills shortages, generational knowledge loss, and supplier-network gaps shows the same logic at sample level (Di Mauro et al., 2018; Mirzaei et al., 2021; Ocicka, 2016). The availability of skilled labour, specialised suppliers, and supporting institutions in the home region acts as a complementary resource endowment that individual firms can access but not produce on their own, which also sheds light on the regional ecosystem findings (Pegoraro et al., 2022).</w:t>
       </w:r>
     </w:p>
     <w:p>
@@ -2924,7 +2924,7 @@
     </w:p>
     <w:p>
       <w:r>
-        <w:t>The results at the exit stage show the importance of legal and regulatory due diligence in the host country long before the decision is announced. The rate and cost of exit among the firms studied were influenced by layoff policies, closure policies, and contractual requirements (Li et al., 2025). The literature review also includes closure fees, fiscal requirements, and the social aspect of plant closure (Di Stefano &amp; Fratocchi, 2019). The exit costs and timelines should be considered as a separate budget line by a firm that is considering reshoring, and, where the evidence on employee and stakeholder reactions is taken seriously (Di Stefano &amp; Fratocchi, 2019), the communication and treatment of the offshore workforce should be planned as a part of the implementation, not as an afterthought.</w:t>
+        <w:t>The results at the exit stage show the importance of legal and regulatory due diligence in the host country long before the decision is announced. The rate and cost of exit among the firms studied were influenced by layoff policies, closure policies, and contractual requirements (Li et al., 2025). The literature review also includes closure fees, fiscal requirements, and the social aspect of plant closure (Di Stefano &amp; Fratocchi, 2019). The exit costs and timelines should be considered as a separate budget line by a firm that is considering reshoring. If the evidence on employee and stakeholder reactions is taken seriously, the communication and treatment of the offshore workforce should also be planned as a part of the implementation, not as an afterthought (Di Stefano &amp; Fratocchi, 2019).</w:t>
       </w:r>
     </w:p>
     <w:p>
@@ -2939,7 +2939,7 @@
     </w:p>
     <w:p>
       <w:r>
-        <w:t>Lastly, the organisational results suggest that the capacity of implementation itself should be given managerial consideration. The relationship between implementation errors and relocation failure suggests the importance of cross-functional coordination — the introduction of production, sourcing, product development, and finance into the reshoring programme early — and the need to treat the return as an organisational change project, rather than a logistics exercise (Boffelli et al., 2021). The evidence of internal silos and poor employee engagement in domestic manufacturing points in the same direction (Mirzaei et al., 2021). In cases where automation is included in the business case, the dual-role evidence must be moderated: technology can compensate the cost disadvantages of home countries, but its implementation requires digital skills, investment, and organisational adaptation of its own (Bilbao-Ubillos et al., 2024; Gupta et al., 2023; D'Ambrosio &amp; Lavoratori, 2025), and an automation-dependent reshoring strategy must include an honest evaluation of the digital preparedness and size of the firm. Collectively, these deliberations respond to the second sub-question: the managerial path to reshoring barriers mitigation is through initial capability and dependency analysis, realistic total costing, host-country exit planning, systematic reestablishment of production capability, intentional supplier reconfiguration, and investment in the own implementation capacity of the organisation.</w:t>
+        <w:t>Lastly, the organisational results suggest that the capacity of implementation itself should be given managerial consideration. The relationship between implementation errors and relocation failure suggests the importance of cross-functional coordination — the introduction of production, sourcing, product development, and finance into the reshoring programme early — and the need to treat the return as an organisational change project, rather than a logistics exercise (Boffelli et al., 2021). The evidence of internal silos and poor employee engagement in domestic manufacturing points in the same direction (Mirzaei et al., 2021). In cases where automation is included in the business case, the dual-role evidence must be moderated: technology can compensate the cost disadvantages of home countries, but its implementation requires digital skills, investment, and organisational adaptation of its own (Bilbao-Ubillos et al., 2024; Gupta et al., 2023; D'Ambrosio &amp; Lavoratori, 2025). An automation-dependent reshoring strategy must therefore include an honest evaluation of the digital preparedness and size of the firm. Collectively, these deliberations respond to the second sub-question: the managerial path to reshoring barriers mitigation is through initial capability and dependency analysis, realistic total costing, host-country exit planning, systematic reestablishment of production capability, intentional supplier reconfiguration, and investment in the own implementation capacity of the organisation.</w:t>
       </w:r>
     </w:p>
     <w:p>
@@ -2962,7 +2962,7 @@
     </w:p>
     <w:p>
       <w:r>
-        <w:t>These constraints are indicative of the required research. Longitudinal studies that track firms through the whole reshoring process, decision to exit, transfer, and ramp-up to stabilised domestic production, would be the most valuable contribution since the current evidence only captures stages separately and cannot demonstrate how barriers accumulate or compound over time. The same reason why this review was forced to limit its Asia-specific assertions to China is why comparative work across other Asian host countries is required: whether exit constraints, supplier dependence, and capability gaps work in the same way in returns from Vietnam, India, or other Asian manufacturing locations is simply unknown. The difference between full and partial reshoring that the case evidence revealed should be systematically studied, as well as the behaviour of host-country suppliers when their customers cut or pull volumes — the adverse-response result is based on one case and can differ significantly depending on the market environment. A study of failed or abandoned reshoring initiatives would rectify the success bias of the published record and would test the implementation-mistakes result on the outcomes where it matters most. Small and medium-sized firms should be studied since the conceptual literature indicates that their reshoring is different in nature — done defensively and with less managerial resources (D'Ambrosio &amp; Lavoratori, 2025) — and most direct evidence is provided by established manufacturers. Lastly, the four-category framework derived here is a synthesis product and would be improved by quantitative testing on a larger sample of implementation cases, and the theoretical reading presented above is interpretive: direct empirical reshoring studies that operationalise transaction-cost and resource-based constructs — asset specificity, switching costs, capability rebuilding time — would demonstrate whether the mechanisms described here in fact drive the barriers observed.</w:t>
+        <w:t>These constraints are indicative of the required research. Longitudinal studies that track firms through the whole reshoring process, decision to exit, transfer, and ramp-up to stabilised domestic production, would be the most valuable contribution since the current evidence only captures stages separately and cannot demonstrate how barriers accumulate or compound over time. The same reason why this review was forced to limit its Asia-specific assertions to China is why comparative work across other Asian host countries is required: whether exit constraints, supplier dependence, and capability gaps work in the same way in returns from Vietnam, India, or other Asian manufacturing locations is simply unknown. The difference between full and partial reshoring that the case evidence revealed should be systematically studied, as well as the behaviour of host-country suppliers when their customers cut or pull volumes — the adverse-response result is based on one case and can differ significantly depending on the market environment. A study of failed or abandoned reshoring initiatives would rectify the success bias of the published record and would test the implementation-mistakes result on the outcomes where it matters most. Small and medium-sized firms should be studied, since most direct evidence is provided by established manufacturers, while the conceptual literature indicates that the reshoring of smaller firms is different in nature — done defensively and with fewer managerial resources (D'Ambrosio &amp; Lavoratori, 2025). Lastly, the four-category framework derived here is a synthesis product and would be improved by quantitative testing on a larger sample of implementation cases, and the theoretical reading presented above is interpretive: direct empirical reshoring studies that operationalise transaction-cost and resource-based constructs — asset specificity, switching costs, capability rebuilding time — would demonstrate whether the mechanisms described here in fact drive the barriers observed.</w:t>
       </w:r>
     </w:p>
     <w:p>

</xml_diff>

<commit_message>
Table 2: replace tick/dash marks with Yes/No in the evidence-type columns
Author is rebuilding the table in the submission document with Yes/No
instead of check marks; canonical source updated to match. Asia-specific
column values (Partial / Yes (single case) / No) unchanged.

Co-Authored-By: Claude Fable 5 <noreply@anthropic.com>
Claude-Session: https://claude.ai/code/session_01HJq9GBe6o3FZumGTYdfLDW
</commit_message>
<xml_diff>
--- a/thesis/COMPILED_DRAFT_FULL.docx
+++ b/thesis/COMPILED_DRAFT_FULL.docx
@@ -973,7 +973,7 @@
               <w:rPr>
                 <w:sz w:val="20"/>
               </w:rPr>
-              <w:t>✓</w:t>
+              <w:t>Yes</w:t>
             </w:r>
           </w:p>
         </w:tc>
@@ -989,7 +989,7 @@
               <w:rPr>
                 <w:sz w:val="20"/>
               </w:rPr>
-              <w:t>✓</w:t>
+              <w:t>Yes</w:t>
             </w:r>
           </w:p>
         </w:tc>
@@ -1005,7 +1005,7 @@
               <w:rPr>
                 <w:sz w:val="20"/>
               </w:rPr>
-              <w:t>—</w:t>
+              <w:t>No</w:t>
             </w:r>
           </w:p>
         </w:tc>
@@ -1071,7 +1071,7 @@
               <w:rPr>
                 <w:sz w:val="20"/>
               </w:rPr>
-              <w:t>—</w:t>
+              <w:t>No</w:t>
             </w:r>
           </w:p>
         </w:tc>
@@ -1087,7 +1087,7 @@
               <w:rPr>
                 <w:sz w:val="20"/>
               </w:rPr>
-              <w:t>✓</w:t>
+              <w:t>Yes</w:t>
             </w:r>
           </w:p>
         </w:tc>
@@ -1103,7 +1103,7 @@
               <w:rPr>
                 <w:sz w:val="20"/>
               </w:rPr>
-              <w:t>—</w:t>
+              <w:t>No</w:t>
             </w:r>
           </w:p>
         </w:tc>
@@ -1169,7 +1169,7 @@
               <w:rPr>
                 <w:sz w:val="20"/>
               </w:rPr>
-              <w:t>✓</w:t>
+              <w:t>Yes</w:t>
             </w:r>
           </w:p>
         </w:tc>
@@ -1185,7 +1185,7 @@
               <w:rPr>
                 <w:sz w:val="20"/>
               </w:rPr>
-              <w:t>—</w:t>
+              <w:t>No</w:t>
             </w:r>
           </w:p>
         </w:tc>
@@ -1201,7 +1201,7 @@
               <w:rPr>
                 <w:sz w:val="20"/>
               </w:rPr>
-              <w:t>✓</w:t>
+              <w:t>Yes</w:t>
             </w:r>
           </w:p>
         </w:tc>
@@ -1267,7 +1267,7 @@
               <w:rPr>
                 <w:sz w:val="20"/>
               </w:rPr>
-              <w:t>✓</w:t>
+              <w:t>Yes</w:t>
             </w:r>
           </w:p>
         </w:tc>
@@ -1283,7 +1283,7 @@
               <w:rPr>
                 <w:sz w:val="20"/>
               </w:rPr>
-              <w:t>✓</w:t>
+              <w:t>Yes</w:t>
             </w:r>
           </w:p>
         </w:tc>
@@ -1299,7 +1299,7 @@
               <w:rPr>
                 <w:sz w:val="20"/>
               </w:rPr>
-              <w:t>✓</w:t>
+              <w:t>Yes</w:t>
             </w:r>
           </w:p>
         </w:tc>
@@ -1365,7 +1365,7 @@
               <w:rPr>
                 <w:sz w:val="20"/>
               </w:rPr>
-              <w:t>✓</w:t>
+              <w:t>Yes</w:t>
             </w:r>
           </w:p>
         </w:tc>
@@ -1381,7 +1381,7 @@
               <w:rPr>
                 <w:sz w:val="20"/>
               </w:rPr>
-              <w:t>—</w:t>
+              <w:t>No</w:t>
             </w:r>
           </w:p>
         </w:tc>
@@ -1397,7 +1397,7 @@
               <w:rPr>
                 <w:sz w:val="20"/>
               </w:rPr>
-              <w:t>—</w:t>
+              <w:t>No</w:t>
             </w:r>
           </w:p>
         </w:tc>
@@ -1463,7 +1463,7 @@
               <w:rPr>
                 <w:sz w:val="20"/>
               </w:rPr>
-              <w:t>✓</w:t>
+              <w:t>Yes</w:t>
             </w:r>
           </w:p>
         </w:tc>
@@ -1479,7 +1479,7 @@
               <w:rPr>
                 <w:sz w:val="20"/>
               </w:rPr>
-              <w:t>—</w:t>
+              <w:t>No</w:t>
             </w:r>
           </w:p>
         </w:tc>
@@ -1495,7 +1495,7 @@
               <w:rPr>
                 <w:sz w:val="20"/>
               </w:rPr>
-              <w:t>—</w:t>
+              <w:t>No</w:t>
             </w:r>
           </w:p>
         </w:tc>
@@ -1561,7 +1561,7 @@
               <w:rPr>
                 <w:sz w:val="20"/>
               </w:rPr>
-              <w:t>—</w:t>
+              <w:t>No</w:t>
             </w:r>
           </w:p>
         </w:tc>
@@ -1577,7 +1577,7 @@
               <w:rPr>
                 <w:sz w:val="20"/>
               </w:rPr>
-              <w:t>✓</w:t>
+              <w:t>Yes</w:t>
             </w:r>
           </w:p>
         </w:tc>
@@ -1593,7 +1593,7 @@
               <w:rPr>
                 <w:sz w:val="20"/>
               </w:rPr>
-              <w:t>—</w:t>
+              <w:t>No</w:t>
             </w:r>
           </w:p>
         </w:tc>
@@ -1659,7 +1659,7 @@
               <w:rPr>
                 <w:sz w:val="20"/>
               </w:rPr>
-              <w:t>—</w:t>
+              <w:t>No</w:t>
             </w:r>
           </w:p>
         </w:tc>
@@ -1675,7 +1675,7 @@
               <w:rPr>
                 <w:sz w:val="20"/>
               </w:rPr>
-              <w:t>✓</w:t>
+              <w:t>Yes</w:t>
             </w:r>
           </w:p>
         </w:tc>
@@ -1691,7 +1691,7 @@
               <w:rPr>
                 <w:sz w:val="20"/>
               </w:rPr>
-              <w:t>✓</w:t>
+              <w:t>Yes</w:t>
             </w:r>
           </w:p>
         </w:tc>
@@ -1757,7 +1757,7 @@
               <w:rPr>
                 <w:sz w:val="20"/>
               </w:rPr>
-              <w:t>✓</w:t>
+              <w:t>Yes</w:t>
             </w:r>
           </w:p>
         </w:tc>
@@ -1773,7 +1773,7 @@
               <w:rPr>
                 <w:sz w:val="20"/>
               </w:rPr>
-              <w:t>✓</w:t>
+              <w:t>Yes</w:t>
             </w:r>
           </w:p>
         </w:tc>
@@ -1789,7 +1789,7 @@
               <w:rPr>
                 <w:sz w:val="20"/>
               </w:rPr>
-              <w:t>✓</w:t>
+              <w:t>Yes</w:t>
             </w:r>
           </w:p>
         </w:tc>
@@ -1855,7 +1855,7 @@
               <w:rPr>
                 <w:sz w:val="20"/>
               </w:rPr>
-              <w:t>✓</w:t>
+              <w:t>Yes</w:t>
             </w:r>
           </w:p>
         </w:tc>
@@ -1871,7 +1871,7 @@
               <w:rPr>
                 <w:sz w:val="20"/>
               </w:rPr>
-              <w:t>✓</w:t>
+              <w:t>Yes</w:t>
             </w:r>
           </w:p>
         </w:tc>
@@ -1887,7 +1887,7 @@
               <w:rPr>
                 <w:sz w:val="20"/>
               </w:rPr>
-              <w:t>✓</w:t>
+              <w:t>Yes</w:t>
             </w:r>
           </w:p>
         </w:tc>
@@ -1953,7 +1953,7 @@
               <w:rPr>
                 <w:sz w:val="20"/>
               </w:rPr>
-              <w:t>✓</w:t>
+              <w:t>Yes</w:t>
             </w:r>
           </w:p>
         </w:tc>
@@ -1969,7 +1969,7 @@
               <w:rPr>
                 <w:sz w:val="20"/>
               </w:rPr>
-              <w:t>—</w:t>
+              <w:t>No</w:t>
             </w:r>
           </w:p>
         </w:tc>
@@ -1985,7 +1985,7 @@
               <w:rPr>
                 <w:sz w:val="20"/>
               </w:rPr>
-              <w:t>✓</w:t>
+              <w:t>Yes</w:t>
             </w:r>
           </w:p>
         </w:tc>
@@ -2051,7 +2051,7 @@
               <w:rPr>
                 <w:sz w:val="20"/>
               </w:rPr>
-              <w:t>✓</w:t>
+              <w:t>Yes</w:t>
             </w:r>
           </w:p>
         </w:tc>
@@ -2067,7 +2067,7 @@
               <w:rPr>
                 <w:sz w:val="20"/>
               </w:rPr>
-              <w:t>—</w:t>
+              <w:t>No</w:t>
             </w:r>
           </w:p>
         </w:tc>
@@ -2083,7 +2083,7 @@
               <w:rPr>
                 <w:sz w:val="20"/>
               </w:rPr>
-              <w:t>—</w:t>
+              <w:t>No</w:t>
             </w:r>
           </w:p>
         </w:tc>
@@ -2149,7 +2149,7 @@
               <w:rPr>
                 <w:sz w:val="20"/>
               </w:rPr>
-              <w:t>✓</w:t>
+              <w:t>Yes</w:t>
             </w:r>
           </w:p>
         </w:tc>
@@ -2165,7 +2165,7 @@
               <w:rPr>
                 <w:sz w:val="20"/>
               </w:rPr>
-              <w:t>—</w:t>
+              <w:t>No</w:t>
             </w:r>
           </w:p>
         </w:tc>
@@ -2181,7 +2181,7 @@
               <w:rPr>
                 <w:sz w:val="20"/>
               </w:rPr>
-              <w:t>—</w:t>
+              <w:t>No</w:t>
             </w:r>
           </w:p>
         </w:tc>
@@ -2247,7 +2247,7 @@
               <w:rPr>
                 <w:sz w:val="20"/>
               </w:rPr>
-              <w:t>✓</w:t>
+              <w:t>Yes</w:t>
             </w:r>
           </w:p>
         </w:tc>
@@ -2263,7 +2263,7 @@
               <w:rPr>
                 <w:sz w:val="20"/>
               </w:rPr>
-              <w:t>✓</w:t>
+              <w:t>Yes</w:t>
             </w:r>
           </w:p>
         </w:tc>
@@ -2279,7 +2279,7 @@
               <w:rPr>
                 <w:sz w:val="20"/>
               </w:rPr>
-              <w:t>✓</w:t>
+              <w:t>Yes</w:t>
             </w:r>
           </w:p>
         </w:tc>
@@ -2345,7 +2345,7 @@
               <w:rPr>
                 <w:sz w:val="20"/>
               </w:rPr>
-              <w:t>✓</w:t>
+              <w:t>Yes</w:t>
             </w:r>
           </w:p>
         </w:tc>
@@ -2361,7 +2361,7 @@
               <w:rPr>
                 <w:sz w:val="20"/>
               </w:rPr>
-              <w:t>✓</w:t>
+              <w:t>Yes</w:t>
             </w:r>
           </w:p>
         </w:tc>
@@ -2377,7 +2377,7 @@
               <w:rPr>
                 <w:sz w:val="20"/>
               </w:rPr>
-              <w:t>✓</w:t>
+              <w:t>Yes</w:t>
             </w:r>
           </w:p>
         </w:tc>
@@ -2443,7 +2443,7 @@
               <w:rPr>
                 <w:sz w:val="20"/>
               </w:rPr>
-              <w:t>✓</w:t>
+              <w:t>Yes</w:t>
             </w:r>
           </w:p>
         </w:tc>
@@ -2459,7 +2459,7 @@
               <w:rPr>
                 <w:sz w:val="20"/>
               </w:rPr>
-              <w:t>✓</w:t>
+              <w:t>Yes</w:t>
             </w:r>
           </w:p>
         </w:tc>
@@ -2475,7 +2475,7 @@
               <w:rPr>
                 <w:sz w:val="20"/>
               </w:rPr>
-              <w:t>✓</w:t>
+              <w:t>Yes</w:t>
             </w:r>
           </w:p>
         </w:tc>
@@ -2541,7 +2541,7 @@
               <w:rPr>
                 <w:sz w:val="20"/>
               </w:rPr>
-              <w:t>—</w:t>
+              <w:t>No</w:t>
             </w:r>
           </w:p>
         </w:tc>
@@ -2557,7 +2557,7 @@
               <w:rPr>
                 <w:sz w:val="20"/>
               </w:rPr>
-              <w:t>✓</w:t>
+              <w:t>Yes</w:t>
             </w:r>
           </w:p>
         </w:tc>
@@ -2573,7 +2573,7 @@
               <w:rPr>
                 <w:sz w:val="20"/>
               </w:rPr>
-              <w:t>✓</w:t>
+              <w:t>Yes</w:t>
             </w:r>
           </w:p>
         </w:tc>
@@ -2639,7 +2639,7 @@
               <w:rPr>
                 <w:sz w:val="20"/>
               </w:rPr>
-              <w:t>✓</w:t>
+              <w:t>Yes</w:t>
             </w:r>
           </w:p>
         </w:tc>
@@ -2655,7 +2655,7 @@
               <w:rPr>
                 <w:sz w:val="20"/>
               </w:rPr>
-              <w:t>✓</w:t>
+              <w:t>Yes</w:t>
             </w:r>
           </w:p>
         </w:tc>
@@ -2671,7 +2671,7 @@
               <w:rPr>
                 <w:sz w:val="20"/>
               </w:rPr>
-              <w:t>—</w:t>
+              <w:t>No</w:t>
             </w:r>
           </w:p>
         </w:tc>

</xml_diff>

<commit_message>
Ch. 6: replace bold answer labels with natural transitions in connected prose
Removed the "Core research question." / "Sub-question 1." / "Sub-question 2." /
"Contribution of the study." / "Scope and closing remarks." bold lead-ins and
wove the same content into a continuous conclusion with natural transitions
("In answer to the core research question...", "The first sub-question
concerned...", "In relation to the second sub-question..."). No claims,
citations, qualifiers, or contributions added or removed; citations stay at
sentence ends; BrE normalised (generalised); one "not only...but also"
construction rephrased.

Co-Authored-By: Claude Fable 5 <noreply@anthropic.com>
Claude-Session: https://claude.ai/code/session_01HJq9GBe6o3FZumGTYdfLDW
</commit_message>
<xml_diff>
--- a/thesis/COMPILED_DRAFT_FULL.docx
+++ b/thesis/COMPILED_DRAFT_FULL.docx
@@ -2975,62 +2975,32 @@
     </w:p>
     <w:p>
       <w:r>
-        <w:t>This thesis aimed to provide an answer to a question that the reshoring literature had left mostly unanswered: not why manufacturing companies choose to take production back home out of Asia, but what impedes them when they attempt to do so. The conclusion brings the analysis to a close, directly answers the research question and the two sub-questions, states the contribution of the study, and ends with a frank discussion of what the evidence does and does not support.</w:t>
+        <w:t>This thesis aimed to provide an answer to a question that the reshoring literature had left mostly unanswered: not why manufacturing companies choose to take production back home out of Asia, but what impedes them when they attempt to do so. The conclusion brings the analysis to a close, answers the research question and the two sub-questions, states the contribution of the study, and ends with a frank discussion of what the evidence does and does not support.</w:t>
       </w:r>
     </w:p>
     <w:p>
       <w:r>
-        <w:rPr>
-          <w:b/>
-        </w:rPr>
-        <w:t>Core research question.</w:t>
-      </w:r>
-      <w:r>
-        <w:t xml:space="preserve"> The key obstacles that manufacturing companies encounter when implementing reshoring from Asian markets, on the evidence reviewed, are, first and foremost, the rebuilding of domestic capability: the skills, machinery, tooling, and the ecosystem of suppliers that have been lost over the years of offshoring and cannot be rebuilt through acquisition alone (Pegoraro et al., 2022). This is closely related to reliance on specialised host-country suppliers, as in the case evidence documented, this limited not only the manner in which a return was conducted but also the extent of the return that was possible (Pedroletti, 2025). These capability-side challenges are exacerbated by the underestimation of operational changes and organisational readiness gaps, along with the new fixed and coordination costs that a return brings (Boffelli et al., 2021). Less obviously but no less durably, they are exacerbated further by host-country exit constraints such as layoff regulations and closure obligations (Li et al., 2025). All these barriers do not exist in a vacuum: a capability gap may lead to operational and relational challenges, and poor organisational preparedness magnifies any other barriers that a firm faces. Implementation thus becomes a separate and challenging phase, rather than a routine that can be taken for granted after the location decision is made.</w:t>
+        <w:t>In answer to the core research question, the review shows that the key obstacles manufacturing companies encounter when implementing reshoring from Asian markets are, first and foremost, connected with the rebuilding of domestic capability. The skills, machinery, tooling, and the ecosystem of suppliers that have been lost over the years of offshoring cannot be rebuilt through acquisition alone (Pegoraro et al., 2022). Closely related is the reliance on specialised host-country suppliers, which in the case evidence limited both the manner in which a return was conducted and the extent of the return that was possible (Pedroletti, 2025). These capability-side challenges are exacerbated by the underestimation of operational changes and organisational readiness gaps, along with the new fixed and coordination costs that a return brings (Boffelli et al., 2021). Less obviously but no less durably, they are exacerbated further by host-country exit constraints such as layoff regulations and closure obligations (Li et al., 2025). None of these barriers exists in a vacuum. A capability gap may lead to operational and relational challenges, and poor organisational preparedness magnifies any other barriers that a firm faces. Implementation thus becomes a separate and challenging phase, rather than a routine that can be taken for granted after the location decision is made.</w:t>
       </w:r>
     </w:p>
     <w:p>
       <w:r>
-        <w:rPr>
-          <w:b/>
-        </w:rPr>
-        <w:t>Sub-question 1.</w:t>
-      </w:r>
-      <w:r>
-        <w:t xml:space="preserve"> The identified barriers were grouped into a systematic firm-level framework of four categories: regulatory/institutional, cultural/organisational, cost/operational, and asset/capability, and eighteen barrier themes based on the literature reviewed. This framework, detailed in full in Table 2, brings together evidence previously reported in the literature in a single structure, based on the type of obstacle, and not on industry, country or individual study. It also highlights areas of strong and weak evidence. The asset/capability barriers have the most widespread and consistent evidence support across evidence types, and the regulatory/institutional category has the least evidence support. This is not a final conclusion on the significance of regulatory barriers in the real world, but rather a characteristic of the evidence base.</w:t>
+        <w:t>The first sub-question concerned how the identified barriers can be categorised into a systematic firm-level framework. Based on the literature reviewed, the barriers were grouped into four categories, regulatory/institutional, cultural/organisational, cost/operational, and asset/capability, and eighteen barrier themes. This framework, detailed in full in Table 2, brings together evidence previously reported in the literature in a single structure, based on the type of obstacle, and not on industry, country or individual study. It also highlights areas of strong and weak evidence. The asset/capability barriers have the most widespread and consistent support across evidence types, while the regulatory/institutional category has the least. This is not a final conclusion on the significance of regulatory barriers in the real world, but rather a characteristic of the evidence base.</w:t>
       </w:r>
     </w:p>
     <w:p>
       <w:r>
-        <w:rPr>
-          <w:b/>
-        </w:rPr>
-        <w:t>Sub-question 2.</w:t>
-      </w:r>
-      <w:r>
-        <w:t xml:space="preserve"> These findings suggest that the barriers identified can be mitigated by tackling them at the point in the return process where they occur. A true total-cost analysis of the return and a capability audit of what the firm controls (not the host-country supplier) helps prevent the underestimation that the evidence repeatedly documents, before commitment. Host country regulatory and contractual due diligence should be budgeted as a separate line item at the exit stage, rather than as an incidental to the move. Capability should be planned as a system of machinery, tooling, software and workforce training, not as a single purchase, during transfer and rebuilding. Wherever the supplier and training ecosystem has thinned, early engagement with the home region's ecosystem is indicated. If the reliance on Asian suppliers cannot be unwound rapidly, a phased or partial approach may be a way of reducing risk, but managers must plan for the cross-country coordination as a permanent operating state. All of these measures have a more general implication: implementation capacity, cross-functional coordination and organisational readiness, is a resource that firms should develop intentionally, as the evidence suggests that it is what makes the other barriers more or less harmful.</w:t>
+        <w:t>In relation to the second sub-question, the findings suggest that the barriers identified can be mitigated by tackling them at the point in the return process where they occur. Before commitment, a true total-cost analysis of the return and a capability audit of what the firm actually controls, as opposed to what is held by the host-country supplier, help prevent the underestimation that the evidence repeatedly documents. At the exit stage, host-country regulatory and contractual due diligence should be budgeted as a separate line item rather than treated as incidental to the move. During transfer and rebuilding, capability should be planned as a system of machinery, tooling, software and workforce training, not as a single purchase. Wherever the supplier and training ecosystem has thinned, early engagement with the home region's ecosystem is indicated. If the reliance on Asian suppliers cannot be unwound rapidly, a phased or partial approach may be a way of reducing risk, but managers must plan for the cross-country coordination as a permanent operating state. Taken together, these measures carry a more general implication. Implementation capacity, understood as cross-functional coordination and organisational readiness, is a resource that firms should develop intentionally, as the evidence suggests that it is what makes the other barriers more or less harmful.</w:t>
       </w:r>
     </w:p>
     <w:p>
       <w:r>
-        <w:rPr>
-          <w:b/>
-        </w:rPr>
-        <w:t>Contribution of the study.</w:t>
-      </w:r>
-      <w:r>
-        <w:t xml:space="preserve"> The main contribution of this thesis is a comprehensive, firm-level framework of the barriers to reshoring implementation from Asian markets, which had been addressed in the literature in a piecemeal fashion, and interpreted through the complementary lenses of Transaction Cost Economics and the Resource-Based View. Together, these two viewpoints provide a reason why a firm that has already made the decision to reshore may still have difficulty reshoring. The decision is about the location, but the execution of the decision involves breaking down the transaction-specific governance arrangements on the host side and building up the scarce, slow-to-acquire resources on the home side, and neither of these is reflected in the location comparison. The thesis addresses the research gap identified in the introduction by refocusing the analytical lens from the question of why firms reshore to the question of how, and by structuring the analytical focus around a firm-level framework instead of a list of disconnected findings.</w:t>
+        <w:t>The main contribution of this thesis is a comprehensive, firm-level framework of the barriers to reshoring implementation from Asian markets, which had been addressed in the literature in a piecemeal fashion, and interpreted through the complementary lenses of Transaction Cost Economics and the Resource-Based View. Together, these two viewpoints provide a reason why a firm that has already made the decision to reshore may still have difficulty reshoring. The decision is about the location, but the execution of the decision involves breaking down the transaction-specific governance arrangements on the host side and building up the scarce, slow-to-acquire resources on the home side, and neither of these is reflected in the location comparison. The thesis addresses the research gap identified in the introduction by refocusing the analytical lens from the question of why firms reshore to the question of how, and by structuring the analytical focus around a firm-level framework instead of a list of disconnected findings.</w:t>
       </w:r>
     </w:p>
     <w:p>
       <w:r>
-        <w:rPr>
-          <w:b/>
-        </w:rPr>
-        <w:t>Scope and closing remarks.</w:t>
-      </w:r>
-      <w:r>
-        <w:t xml:space="preserve"> This contribution should be read within the bounds that the thesis has carefully set out throughout. The formal analytical sample consists of twenty-one studies, while the direct implementation evidence that is genuinely Asia-specific is based on two single case studies, both reporting returns from China to Western Europe (Pegoraro et al., 2022; Pedroletti, 2025). The framework should thus be viewed as a map of what the current literature reveals, rather than a ranking of universal barriers, and certainly not a statement that can be generalized to the Asian markets in general. In that context, the results show that the challenge of reshoring is not so much about the decision to reshore as about the reconstruction of the productive capability that has been eroded over the years by offshoring — and that reshoring is a different project, with its own rationale, its own costs, and its own potential for partial or incomplete success.</w:t>
+        <w:t>This contribution should be read within the bounds that the thesis has carefully set out throughout. The formal analytical sample consists of twenty-one studies, while the direct implementation evidence that is genuinely Asia-specific is based on two single case studies, both reporting returns from China to Western Europe (Pegoraro et al., 2022; Pedroletti, 2025). The framework should thus be viewed as a map of what the current literature reveals, rather than a ranking of universal barriers, and certainly not a statement that can be generalised to Asian markets as a whole. In that context, the results show that the challenge of reshoring is not so much about the decision to reshore as about the reconstruction of the productive capability that has been eroded over the years by offshoring. Reshoring emerges as a project of its own, with its own rationale, its own costs, and its own potential for partial or incomplete success.</w:t>
       </w:r>
     </w:p>
     <w:p>

</xml_diff>

<commit_message>
Ch. 6: split exit-constraints claim per source; apply reviewer style fixes
The composite layoff-regulations-and-closure-obligations sentence is now
two sentences, each citing only the source that supports it (Li et al.
2025: layoff regulations locking investments and raising exit costs,
sect. 4.2; Di Stefano & Fratocchi 2019: plant-closure obligations,
review-level, p. 134), with the review-level status signalled in the
wording. Applied the ten style corrections (opening reworded, "further
complicated", "Reshoring also creates", "were grouped", "comprehensive
total-cost analysis", regional-actors sentence, implementation-capacity
transition, contribution sentence split into three, "The findings are
subject to several limitations", final sentence de-literarised). Content,
certainty, and all other citations unchanged.

Co-Authored-By: Claude Fable 5 <noreply@anthropic.com>
Claude-Session: https://claude.ai/code/session_01HJq9GBe6o3FZumGTYdfLDW
</commit_message>
<xml_diff>
--- a/thesis/COMPILED_DRAFT_FULL.docx
+++ b/thesis/COMPILED_DRAFT_FULL.docx
@@ -2975,32 +2975,32 @@
     </w:p>
     <w:p>
       <w:r>
-        <w:t>This thesis set out to answer a question that the reshoring literature had left largely open: what stands in the way of manufacturing companies when they attempt to bring production back home from Asia after the decision to return has been made.</w:t>
+        <w:t>This thesis set out to answer a question that the reshoring literature had left largely open: what barriers manufacturing firms face when attempting to bring production back from Asia after the decision to reshore has been made.</w:t>
       </w:r>
     </w:p>
     <w:p>
       <w:r>
-        <w:t>The evidence reviewed identifies the rebuilding of domestic capability as the central obstacle. The skills, machinery, tooling, and the ecosystem of suppliers that were lost over the years of offshoring cannot be rebuilt through acquisition alone (Pegoraro et al., 2022). Closely related is the reliance on specialised host-country suppliers, which in the case evidence limited both the manner in which a return was conducted and the extent of the return that was possible (Pedroletti, 2025). These capability-side challenges are worsened by the underestimation of operational changes and by organisational readiness gaps (Boffelli et al., 2021). The return also brings new fixed and coordination costs of its own (Li et al., 2025; Pedroletti, 2025). A less visible but lasting obstacle lies in host-country exit constraints such as layoff regulations and closure obligations (Li et al., 2025; Di Stefano &amp; Fratocchi, 2019). The barriers are also interconnected. A capability gap may lead to operational and relational challenges, and poor organisational preparedness magnifies any other barriers that a firm faces. Implementation therefore emerges as a separate and demanding phase that cannot be taken for granted once the location decision is made.</w:t>
+        <w:t>The evidence reviewed identifies the rebuilding of domestic capability as the central obstacle. The skills, machinery, tooling, and the ecosystem of suppliers that were lost over the years of offshoring cannot be rebuilt through acquisition alone (Pegoraro et al., 2022). Closely related is the reliance on specialised host-country suppliers, which in the case evidence limited both the manner in which a return was conducted and the extent of the return that was possible (Pedroletti, 2025). These capability constraints are further complicated by the underestimation of operational changes and gaps in organisational readiness (Boffelli et al., 2021). Reshoring also creates new fixed and coordination costs (Li et al., 2025; Pedroletti, 2025). A less visible but lasting obstacle lies in host-country exit constraints. Strict layoff regulations in offshored locations can lock production and investments in place and raise the cost of exit (Li et al., 2025). Obligations connected to the closure of a foreign plant are a further constraint reported in the literature (Di Stefano &amp; Fratocchi, 2019). The barriers are also interconnected. A capability gap may lead to operational and relational challenges, and poor organisational preparedness magnifies any other barriers that a firm faces. Implementation therefore emerges as a separate and demanding phase that cannot be taken for granted once the location decision is made.</w:t>
       </w:r>
     </w:p>
     <w:p>
       <w:r>
-        <w:t>The barriers identified in the literature could be grouped into a systematic firm-level framework of four categories, regulatory/institutional, cultural/organisational, cost/operational, and asset/capability, comprising eighteen barrier themes. This framework, detailed in full in Table 2, brings together evidence previously reported in the literature in a single structure that is organised by the type of obstacle, independent of industry, country or individual study. It also shows where the evidence is strong and where it is thin. The asset/capability barriers have the most widespread and consistent support across evidence types, while the regulatory/institutional category has the least. This reflects the composition of the evidence base and should not be read as a final conclusion about the real-world significance of regulatory barriers.</w:t>
+        <w:t>The barriers identified in the literature were grouped into a systematic firm-level framework of four categories, regulatory/institutional, cultural/organisational, cost/operational, and asset/capability, comprising eighteen barrier themes. This framework, detailed in full in Table 2, brings together evidence previously reported in the literature in a single structure that is organised by the type of obstacle, independent of industry, country or individual study. It also shows where the evidence is strong and where it is thin. The asset/capability barriers have the most widespread and consistent support across evidence types, while the regulatory/institutional category has the least. This reflects the composition of the evidence base and should not be read as a final conclusion about the real-world significance of regulatory barriers.</w:t>
       </w:r>
     </w:p>
     <w:p>
       <w:r>
-        <w:t>For management practice, the findings suggest that the identified barriers can be mitigated by tackling them at the point in the return process where they occur. Before commitment, a true total-cost analysis of the return and a capability audit of what the firm actually controls, as opposed to what is held by the host-country supplier, help prevent the underestimation that the evidence repeatedly documents. At the exit stage, host-country regulatory and contractual due diligence should be budgeted as a separate line item instead of being treated as incidental to the move. During transfer and rebuilding, capability should be planned as a system of machinery, tooling, software and workforce training, not as a single purchase. Wherever the supplier and training ecosystem has thinned, early engagement with the home region's ecosystem is indicated. If the reliance on Asian suppliers cannot be unwound rapidly, a phased or partial approach may reduce risk, but managers must then plan for cross-country coordination as a permanent operating state. A broader implication runs through all of these measures. Implementation capacity, understood as cross-functional coordination and organisational readiness, is a resource that firms should develop intentionally, as the evidence suggests that it is what makes the other barriers more or less harmful.</w:t>
+        <w:t>For management practice, the findings suggest that the identified barriers can be mitigated by tackling them at the point in the return process where they occur. Before commitment, a comprehensive total-cost analysis of the return and a capability audit of what the firm actually controls, as opposed to what is held by the host-country supplier, help prevent the underestimation that the evidence repeatedly documents. At the exit stage, host-country regulatory and contractual due diligence should be budgeted as a separate line item instead of being treated as incidental to the move. During transfer and rebuilding, capability should be planned as a system of machinery, tooling, software and workforce training, not as a single purchase. Where the domestic supplier and training ecosystem has weakened, firms may need to engage with relevant regional actors at an early stage. If the reliance on Asian suppliers cannot be unwound rapidly, a phased or partial approach may reduce risk, but managers must then plan for cross-country coordination as a permanent operating state. These measures also point to the importance of implementation capacity. Understood as cross-functional coordination and organisational readiness, it is a resource that firms should develop intentionally, as the evidence suggests that it is what makes the other barriers more or less harmful.</w:t>
       </w:r>
     </w:p>
     <w:p>
       <w:r>
-        <w:t>The main contribution of this thesis is a comprehensive, firm-level framework of the barriers to reshoring implementation from Asian markets, which had previously been addressed in the literature in a piecemeal fashion, interpreted through the complementary lenses of Transaction Cost Economics and the Resource-Based View. Together, these two viewpoints help to explain why a firm that has already decided to reshore may still struggle to do so. The decision concerns the location, but carrying it out involves dismantling the transaction-specific governance arrangements on the host side and building up the scarce, slow-to-acquire resources on the home side, and neither of these is reflected in the location comparison. The thesis addresses the research gap identified in the introduction by shifting attention from the reasons behind reshoring decisions to the barriers that arise during their implementation, and by structuring the analysis around a firm-level framework instead of a list of disconnected findings.</w:t>
+        <w:t>The main contribution of this thesis is a consolidated firm-level framework of the barriers to reshoring implementation from Asian markets. These barriers had previously been discussed separately across the literature. The framework interprets them through the complementary lenses of Transaction Cost Economics and the Resource-Based View. Together, these two viewpoints help to explain why a firm that has already decided to reshore may still struggle to do so. The decision concerns the location, but carrying it out involves dismantling the transaction-specific governance arrangements on the host side and building up the scarce, slow-to-acquire resources on the home side, and neither of these is reflected in the location comparison. The thesis addresses the research gap identified in the introduction by shifting attention from the reasons behind reshoring decisions to the barriers that arise during their implementation, and by structuring the analysis around a firm-level framework instead of a list of disconnected findings.</w:t>
       </w:r>
     </w:p>
     <w:p>
       <w:r>
-        <w:t>This contribution should be read within the bounds that the thesis has set out throughout. The formal analytical sample consists of twenty-one studies, and the direct implementation evidence that is genuinely Asia-specific comes from two single case studies, both reporting returns from China to Western Europe (Pegoraro et al., 2022; Pedroletti, 2025). The framework should therefore be viewed as a map of what the current literature reveals rather than a ranking of universal barriers, and it cannot be generalised to Asian markets as a whole. Within these limits, the results show that the difficulty of reshoring lies less in the decision itself than in the reconstruction of the productive capability that offshoring eroded over the years. Reshoring emerges as a project of its own, with its own rationale, its own costs, and its own potential for partial or incomplete success.</w:t>
+        <w:t>The findings are subject to several limitations. The formal analytical sample consists of twenty-one studies, and the direct implementation evidence that is genuinely Asia-specific comes from two single case studies, both reporting returns from China to Western Europe (Pegoraro et al., 2022; Pedroletti, 2025). The framework is thus best viewed as a map of what the current literature reveals rather than a ranking of universal barriers, and it cannot be generalised to Asian markets as a whole. Within these limits, the results show that the difficulty of reshoring lies less in the decision itself than in the reconstruction of the productive capability that offshoring eroded over the years. Reshoring should therefore be treated as a distinct implementation project that involves separate costs and may result in only a partial return.</w:t>
       </w:r>
     </w:p>
     <w:p>

</xml_diff>